<commit_message>
Update system design: GPT-only LLM, LangSmith-only observability, remove data retention and risks sections
</commit_message>
<xml_diff>
--- a/docs/ResearchIQ_System_Design.docx
+++ b/docs/ResearchIQ_System_Design.docx
@@ -8,8 +8,68 @@
       </w:pPr>
       <w:r>
         <w:rPr>
-          <w:sz w:val="132"/>
-          <w:szCs w:val="132"/>
+          <w:sz w:val="22"/>
+          <w:szCs w:val="22"/>
+        </w:rPr>
+        <w:t xml:space="preserve"/>
+      </w:r>
+    </w:p>
+    <w:p>
+      <w:pPr>
+        <w:spacing w:after="0" w:before="0"/>
+      </w:pPr>
+      <w:r>
+        <w:rPr>
+          <w:sz w:val="22"/>
+          <w:szCs w:val="22"/>
+        </w:rPr>
+        <w:t xml:space="preserve"/>
+      </w:r>
+    </w:p>
+    <w:p>
+      <w:pPr>
+        <w:spacing w:after="0" w:before="0"/>
+      </w:pPr>
+      <w:r>
+        <w:rPr>
+          <w:sz w:val="22"/>
+          <w:szCs w:val="22"/>
+        </w:rPr>
+        <w:t xml:space="preserve"/>
+      </w:r>
+    </w:p>
+    <w:p>
+      <w:pPr>
+        <w:spacing w:after="0" w:before="0"/>
+      </w:pPr>
+      <w:r>
+        <w:rPr>
+          <w:sz w:val="22"/>
+          <w:szCs w:val="22"/>
+        </w:rPr>
+        <w:t xml:space="preserve"/>
+      </w:r>
+    </w:p>
+    <w:p>
+      <w:pPr>
+        <w:spacing w:after="0" w:before="0"/>
+      </w:pPr>
+      <w:r>
+        <w:rPr>
+          <w:sz w:val="22"/>
+          <w:szCs w:val="22"/>
+        </w:rPr>
+        <w:t xml:space="preserve"/>
+      </w:r>
+    </w:p>
+    <w:p>
+      <w:pPr>
+        <w:spacing w:after="0" w:before="0"/>
+      </w:pPr>
+      <w:r>
+        <w:rPr>
+          <w:sz w:val="22"/>
+          <w:szCs w:val="22"/>
         </w:rPr>
         <w:t xml:space="preserve"/>
       </w:r>
@@ -100,8 +160,20 @@
       </w:pPr>
       <w:r>
         <w:rPr>
-          <w:sz w:val="44"/>
-          <w:szCs w:val="44"/>
+          <w:sz w:val="22"/>
+          <w:szCs w:val="22"/>
+        </w:rPr>
+        <w:t xml:space="preserve"/>
+      </w:r>
+    </w:p>
+    <w:p>
+      <w:pPr>
+        <w:spacing w:after="0" w:before="0"/>
+      </w:pPr>
+      <w:r>
+        <w:rPr>
+          <w:sz w:val="22"/>
+          <w:szCs w:val="22"/>
         </w:rPr>
         <w:t xml:space="preserve"/>
       </w:r>
@@ -377,8 +449,44 @@
       </w:pPr>
       <w:r>
         <w:rPr>
-          <w:sz w:val="88"/>
-          <w:szCs w:val="88"/>
+          <w:sz w:val="22"/>
+          <w:szCs w:val="22"/>
+        </w:rPr>
+        <w:t xml:space="preserve"/>
+      </w:r>
+    </w:p>
+    <w:p>
+      <w:pPr>
+        <w:spacing w:after="0" w:before="0"/>
+      </w:pPr>
+      <w:r>
+        <w:rPr>
+          <w:sz w:val="22"/>
+          <w:szCs w:val="22"/>
+        </w:rPr>
+        <w:t xml:space="preserve"/>
+      </w:r>
+    </w:p>
+    <w:p>
+      <w:pPr>
+        <w:spacing w:after="0" w:before="0"/>
+      </w:pPr>
+      <w:r>
+        <w:rPr>
+          <w:sz w:val="22"/>
+          <w:szCs w:val="22"/>
+        </w:rPr>
+        <w:t xml:space="preserve"/>
+      </w:r>
+    </w:p>
+    <w:p>
+      <w:pPr>
+        <w:spacing w:after="0" w:before="0"/>
+      </w:pPr>
+      <w:r>
+        <w:rPr>
+          <w:sz w:val="22"/>
+          <w:szCs w:val="22"/>
         </w:rPr>
         <w:t xml:space="preserve"/>
       </w:r>
@@ -577,7 +685,7 @@
           <w:sz w:val="22"/>
           <w:szCs w:val="22"/>
         </w:rPr>
-        <w:t xml:space="preserve">A natural-language research query or topic (e.g., 'What are the latest advances in agentic RAG?', 'Competitive landscape for AI coding assistants in 2025').</w:t>
+        <w:t xml:space="preserve">A natural-language research query or topic.</w:t>
       </w:r>
     </w:p>
     <w:p>
@@ -607,7 +715,7 @@
           <w:sz w:val="22"/>
           <w:szCs w:val="22"/>
         </w:rPr>
-        <w:t xml:space="preserve">A structured Markdown intelligence report containing: an executive summary, key findings grouped by sub-topic, source citations, and a confidence assessment.</w:t>
+        <w:t xml:space="preserve">A structured intelligence report containing an executive summary, key findings grouped by sub-topic, source citations, and a confidence assessment.</w:t>
       </w:r>
     </w:p>
     <w:p>
@@ -637,7 +745,7 @@
           <w:sz w:val="22"/>
           <w:szCs w:val="22"/>
         </w:rPr>
-        <w:t xml:space="preserve">The system retrieves and synthesises publicly available web content and user-supplied documents. It does not perform primary research, make recommendations involving regulated domains (medical, legal, financial), or generate novel analysis beyond what the retrieved sources support.</w:t>
+        <w:t xml:space="preserve">The system retrieves and synthesises publicly available web content and user-supplied documents. It does not perform primary research, make confident recommendations in regulated domains (medical, legal, financial advice), or generate novel analysis beyond what the retrieved sources support. It is not a general-purpose chatbot.</w:t>
       </w:r>
     </w:p>
     <w:p>
@@ -680,7 +788,7 @@
           <w:sz w:val="22"/>
           <w:szCs w:val="22"/>
         </w:rPr>
-        <w:t xml:space="preserve">The problem is well-suited to an agentic AI system because it decomposes naturally into sub-tasks (query decomposition → retrieval → synthesis → formatting), each of which can be handled by a specialist agent with domain-specific tools. The success criterion is unambiguous: a high-quality, factual, well-cited report generated in under 60 seconds for a typical 4-subtask query.</w:t>
+        <w:t xml:space="preserve">The problem is well-suited to an agentic AI system because it decomposes naturally into sub-tasks — query decomposition, retrieval, synthesis, and formatting — each handled by a specialist agent with domain-specific tools. The success criterion is unambiguous: a high-quality, factual, well-cited report generated in under 60 seconds for a typical 4-subtask query.</w:t>
       </w:r>
     </w:p>
     <w:p>
@@ -710,6 +818,20 @@
           <w:szCs w:val="28"/>
         </w:rPr>
         <w:t xml:space="preserve">1.4 Target Users &amp; Use Cases</w:t>
+      </w:r>
+    </w:p>
+    <w:p>
+      <w:pPr>
+        <w:spacing w:after="60" w:before="60"/>
+      </w:pPr>
+      <w:r>
+        <w:rPr>
+          <w:rFonts w:ascii="Arial" w:cs="Arial" w:eastAsia="Arial" w:hAnsi="Arial"/>
+          <w:color w:val="595959"/>
+          <w:sz w:val="22"/>
+          <w:szCs w:val="22"/>
+        </w:rPr>
+        <w:t xml:space="preserve">ResearchIQ is designed for professionals who need structured, sourced intelligence quickly without doing manual research. Primary users are:</w:t>
       </w:r>
     </w:p>
     <w:tbl>
@@ -1747,7 +1869,7 @@
           <w:sz w:val="22"/>
           <w:szCs w:val="22"/>
         </w:rPr>
-        <w:t xml:space="preserve">When users ingest documents or the system scrapes web pages, PII may incidentally appear in source content (e.g., author names on papers, contact sections of websites). The following controls are applied:</w:t>
+        <w:t xml:space="preserve">When users ingest documents or the system scrapes web pages, PII may incidentally appear in source content. The following controls are applied:</w:t>
       </w:r>
     </w:p>
     <w:p>
@@ -1821,6 +1943,23 @@
     </w:p>
     <w:p>
       <w:pPr>
+        <w:pStyle w:val="Heading2"/>
+        <w:spacing w:after="120" w:before="280"/>
+      </w:pPr>
+      <w:r>
+        <w:rPr>
+          <w:rFonts w:ascii="Arial" w:cs="Arial" w:eastAsia="Arial" w:hAnsi="Arial"/>
+          <w:b/>
+          <w:bCs/>
+          <w:color w:val="2E75B6"/>
+          <w:sz w:val="28"/>
+          <w:szCs w:val="28"/>
+        </w:rPr>
+        <w:t xml:space="preserve">2.3 Guardrails</w:t>
+      </w:r>
+    </w:p>
+    <w:p>
+      <w:pPr>
         <w:pStyle w:val="Heading3"/>
         <w:spacing w:after="80" w:before="200"/>
       </w:pPr>
@@ -1833,7 +1972,7 @@
           <w:sz w:val="24"/>
           <w:szCs w:val="24"/>
         </w:rPr>
-        <w:t xml:space="preserve">2.2.3 Data Retention</w:t>
+        <w:t xml:space="preserve">2.3.1 Input Guardrails</w:t>
       </w:r>
     </w:p>
     <w:tbl>
@@ -1880,7 +2019,7 @@
                 <w:sz w:val="20"/>
                 <w:szCs w:val="20"/>
               </w:rPr>
-              <w:t xml:space="preserve">Data Type</w:t>
+              <w:t xml:space="preserve">Guardrail</w:t>
             </w:r>
           </w:p>
         </w:tc>
@@ -1911,7 +2050,7 @@
                 <w:sz w:val="20"/>
                 <w:szCs w:val="20"/>
               </w:rPr>
-              <w:t xml:space="preserve">Retention Policy</w:t>
+              <w:t xml:space="preserve">Implementation</w:t>
             </w:r>
           </w:p>
         </w:tc>
@@ -1944,7 +2083,7 @@
                 <w:sz w:val="20"/>
                 <w:szCs w:val="20"/>
               </w:rPr>
-              <w:t xml:space="preserve">Web search results</w:t>
+              <w:t xml:space="preserve">Query length limit</w:t>
             </w:r>
           </w:p>
         </w:tc>
@@ -1975,7 +2114,7 @@
                 <w:sz w:val="20"/>
                 <w:szCs w:val="20"/>
               </w:rPr>
-              <w:t xml:space="preserve">In-memory only; discarded after report generation</w:t>
+              <w:t xml:space="preserve">Maximum 500 characters; enforced at FastAPI request validation via Pydantic Field(max_length=500)</w:t>
             </w:r>
           </w:p>
         </w:tc>
@@ -2008,7 +2147,7 @@
                 <w:sz w:val="20"/>
                 <w:szCs w:val="20"/>
               </w:rPr>
-              <w:t xml:space="preserve">Scraped page content</w:t>
+              <w:t xml:space="preserve">Topic safety filter</w:t>
             </w:r>
           </w:p>
         </w:tc>
@@ -2039,7 +2178,7 @@
                 <w:sz w:val="20"/>
                 <w:szCs w:val="20"/>
               </w:rPr>
-              <w:t xml:space="preserve">In-memory only; not persisted unless explicitly ingested</w:t>
+              <w:t xml:space="preserve">Coordinator agent system prompt instructs it to refuse queries requesting harmful, illegal, or privacy-invasive research. Returns a structured RefusalResponse with reason.</w:t>
             </w:r>
           </w:p>
         </w:tc>
@@ -2072,7 +2211,7 @@
                 <w:sz w:val="20"/>
                 <w:szCs w:val="20"/>
               </w:rPr>
-              <w:t xml:space="preserve">Knowledge base chunks</w:t>
+              <w:t xml:space="preserve">Rate limiting</w:t>
             </w:r>
           </w:p>
         </w:tc>
@@ -2103,7 +2242,7 @@
                 <w:sz w:val="20"/>
                 <w:szCs w:val="20"/>
               </w:rPr>
-              <w:t xml:space="preserve">Persisted in Qdrant until explicitly deleted via DELETE /ingest/{id}</w:t>
+              <w:t xml:space="preserve">FastAPI middleware enforces per-IP rate limits (10 req/min for /research, 20 req/min for /ingest) using slowapi</w:t>
             </w:r>
           </w:p>
         </w:tc>
@@ -2136,7 +2275,7 @@
                 <w:sz w:val="20"/>
                 <w:szCs w:val="20"/>
               </w:rPr>
-              <w:t xml:space="preserve">LangSmith / Langfuse traces</w:t>
+              <w:t xml:space="preserve">Ingest file size</w:t>
             </w:r>
           </w:p>
         </w:tc>
@@ -2167,71 +2306,7 @@
                 <w:sz w:val="20"/>
                 <w:szCs w:val="20"/>
               </w:rPr>
-              <w:t xml:space="preserve">30-day default retention in third-party observability platform; configurable</w:t>
-            </w:r>
-          </w:p>
-        </w:tc>
-      </w:tr>
-      <w:tr>
-        <w:tc>
-          <w:tcPr>
-            <w:tcW w:type="dxa" w:w="2800"/>
-            <w:tcBorders>
-              <w:top w:val="single" w:color="CCCCCC" w:sz="1"/>
-              <w:left w:val="single" w:color="CCCCCC" w:sz="1"/>
-              <w:bottom w:val="single" w:color="CCCCCC" w:sz="1"/>
-              <w:right w:val="single" w:color="CCCCCC" w:sz="1"/>
-            </w:tcBorders>
-            <w:shd w:fill="FFFFFF" w:val="clear"/>
-            <w:tcMar>
-              <w:top w:type="dxa" w:w="80"/>
-              <w:left w:type="dxa" w:w="120"/>
-              <w:bottom w:type="dxa" w:w="80"/>
-              <w:right w:type="dxa" w:w="120"/>
-            </w:tcMar>
-          </w:tcPr>
-          <w:p>
-            <w:r>
-              <w:rPr>
-                <w:rFonts w:ascii="Arial" w:cs="Arial" w:eastAsia="Arial" w:hAnsi="Arial"/>
-                <w:b w:val="false"/>
-                <w:bCs w:val="false"/>
-                <w:color w:val="595959"/>
-                <w:sz w:val="20"/>
-                <w:szCs w:val="20"/>
-              </w:rPr>
-              <w:t xml:space="preserve">Generated reports</w:t>
-            </w:r>
-          </w:p>
-        </w:tc>
-        <w:tc>
-          <w:tcPr>
-            <w:tcW w:type="dxa" w:w="6560"/>
-            <w:tcBorders>
-              <w:top w:val="single" w:color="CCCCCC" w:sz="1"/>
-              <w:left w:val="single" w:color="CCCCCC" w:sz="1"/>
-              <w:bottom w:val="single" w:color="CCCCCC" w:sz="1"/>
-              <w:right w:val="single" w:color="CCCCCC" w:sz="1"/>
-            </w:tcBorders>
-            <w:shd w:fill="F2F2F2" w:val="clear"/>
-            <w:tcMar>
-              <w:top w:type="dxa" w:w="80"/>
-              <w:left w:type="dxa" w:w="120"/>
-              <w:bottom w:type="dxa" w:w="80"/>
-              <w:right w:type="dxa" w:w="120"/>
-            </w:tcMar>
-          </w:tcPr>
-          <w:p>
-            <w:r>
-              <w:rPr>
-                <w:rFonts w:ascii="Arial" w:cs="Arial" w:eastAsia="Arial" w:hAnsi="Arial"/>
-                <w:b w:val="false"/>
-                <w:bCs w:val="false"/>
-                <w:color w:val="595959"/>
-                <w:sz w:val="20"/>
-                <w:szCs w:val="20"/>
-              </w:rPr>
-              <w:t xml:space="preserve">Saved to user's Notion workspace; not stored by ResearchIQ</w:t>
+              <w:t xml:space="preserve">Maximum 10MB per document; enforced in /ingest endpoint before processing</w:t>
             </w:r>
           </w:p>
         </w:tc>
@@ -2247,23 +2322,6 @@
           <w:szCs w:val="22"/>
         </w:rPr>
         <w:t xml:space="preserve"/>
-      </w:r>
-    </w:p>
-    <w:p>
-      <w:pPr>
-        <w:pStyle w:val="Heading2"/>
-        <w:spacing w:after="120" w:before="280"/>
-      </w:pPr>
-      <w:r>
-        <w:rPr>
-          <w:rFonts w:ascii="Arial" w:cs="Arial" w:eastAsia="Arial" w:hAnsi="Arial"/>
-          <w:b/>
-          <w:bCs/>
-          <w:color w:val="2E75B6"/>
-          <w:sz w:val="28"/>
-          <w:szCs w:val="28"/>
-        </w:rPr>
-        <w:t xml:space="preserve">2.3 Guardrails</w:t>
       </w:r>
     </w:p>
     <w:p>
@@ -2280,7 +2338,7 @@
           <w:sz w:val="24"/>
           <w:szCs w:val="24"/>
         </w:rPr>
-        <w:t xml:space="preserve">2.3.1 Input Guardrails</w:t>
+        <w:t xml:space="preserve">2.3.2 Output Guardrails</w:t>
       </w:r>
     </w:p>
     <w:tbl>
@@ -2391,7 +2449,7 @@
                 <w:sz w:val="20"/>
                 <w:szCs w:val="20"/>
               </w:rPr>
-              <w:t xml:space="preserve">Query length limit</w:t>
+              <w:t xml:space="preserve">Citation enforcement</w:t>
             </w:r>
           </w:p>
         </w:tc>
@@ -2422,7 +2480,7 @@
                 <w:sz w:val="20"/>
                 <w:szCs w:val="20"/>
               </w:rPr>
-              <w:t xml:space="preserve">Maximum 500 characters; enforced at FastAPI request validation via Pydantic Field(max_length=500)</w:t>
+              <w:t xml:space="preserve">Report Writer agent is prompted to include a source citation for every factual claim. Claims without traceable sources are marked [UNVERIFIED] and flagged in the report metadata.</w:t>
             </w:r>
           </w:p>
         </w:tc>
@@ -2455,7 +2513,7 @@
                 <w:sz w:val="20"/>
                 <w:szCs w:val="20"/>
               </w:rPr>
-              <w:t xml:space="preserve">Topic safety filter</w:t>
+              <w:t xml:space="preserve">Hallucination mitigation</w:t>
             </w:r>
           </w:p>
         </w:tc>
@@ -2486,7 +2544,7 @@
                 <w:sz w:val="20"/>
                 <w:szCs w:val="20"/>
               </w:rPr>
-              <w:t xml:space="preserve">Coordinator agent system prompt instructs it to refuse queries requesting harmful, illegal, or privacy-invasive research. Returns a structured RefusalResponse with reason.</w:t>
+              <w:t xml:space="preserve">Retrieved source content is injected directly into the report writer's context window. The prompt explicitly forbids adding information not present in the retrieved sources.</w:t>
             </w:r>
           </w:p>
         </w:tc>
@@ -2519,7 +2577,7 @@
                 <w:sz w:val="20"/>
                 <w:szCs w:val="20"/>
               </w:rPr>
-              <w:t xml:space="preserve">Rate limiting</w:t>
+              <w:t xml:space="preserve">Confidence scoring</w:t>
             </w:r>
           </w:p>
         </w:tc>
@@ -2550,7 +2608,7 @@
                 <w:sz w:val="20"/>
                 <w:szCs w:val="20"/>
               </w:rPr>
-              <w:t xml:space="preserve">FastAPI middleware enforces per-IP rate limits (10 req/min for /research, 20 req/min for /ingest) using slowapi</w:t>
+              <w:t xml:space="preserve">Each report section includes a confidence field (High / Medium / Low) based on source count and recency.</w:t>
             </w:r>
           </w:p>
         </w:tc>
@@ -2583,7 +2641,7 @@
                 <w:sz w:val="20"/>
                 <w:szCs w:val="20"/>
               </w:rPr>
-              <w:t xml:space="preserve">Ingest file size</w:t>
+              <w:t xml:space="preserve">Output schema validation</w:t>
             </w:r>
           </w:p>
         </w:tc>
@@ -2614,7 +2672,7 @@
                 <w:sz w:val="20"/>
                 <w:szCs w:val="20"/>
               </w:rPr>
-              <w:t xml:space="preserve">Maximum 10MB per document; enforced in /ingest endpoint before processing</w:t>
+              <w:t xml:space="preserve">Report Writer produces a Pydantic-validated ResearchReport object. If validation fails, the pipeline retries up to 2 times with a corrective prompt before returning an error.</w:t>
             </w:r>
           </w:p>
         </w:tc>
@@ -2646,7 +2704,161 @@
           <w:sz w:val="24"/>
           <w:szCs w:val="24"/>
         </w:rPr>
-        <w:t xml:space="preserve">2.3.2 Output Guardrails</w:t>
+        <w:t xml:space="preserve">2.3.3 Model-Level Safety</w:t>
+      </w:r>
+    </w:p>
+    <w:p>
+      <w:pPr>
+        <w:pStyle w:val="ListParagraph"/>
+        <w:numPr>
+          <w:ilvl w:val="0"/>
+          <w:numId w:val="2"/>
+        </w:numPr>
+        <w:spacing w:after="40" w:before="40"/>
+      </w:pPr>
+      <w:r>
+        <w:rPr>
+          <w:rFonts w:ascii="Arial" w:cs="Arial" w:eastAsia="Arial" w:hAnsi="Arial"/>
+          <w:color w:val="595959"/>
+          <w:sz w:val="22"/>
+          <w:szCs w:val="22"/>
+        </w:rPr>
+        <w:t xml:space="preserve">GPT-4o (primary LLM) includes OpenAI's built-in safety features, which refuse harmful, deceptive, or dangerous content generation by default.</w:t>
+      </w:r>
+    </w:p>
+    <w:p>
+      <w:pPr>
+        <w:pStyle w:val="ListParagraph"/>
+        <w:numPr>
+          <w:ilvl w:val="0"/>
+          <w:numId w:val="2"/>
+        </w:numPr>
+        <w:spacing w:after="40" w:before="40"/>
+      </w:pPr>
+      <w:r>
+        <w:rPr>
+          <w:rFonts w:ascii="Arial" w:cs="Arial" w:eastAsia="Arial" w:hAnsi="Arial"/>
+          <w:color w:val="595959"/>
+          <w:sz w:val="22"/>
+          <w:szCs w:val="22"/>
+        </w:rPr>
+        <w:t xml:space="preserve">System prompts for each agent explicitly scope the agent's role and restrict off-topic actions (e.g., the Web Researcher agent is instructed to only retrieve and summarise; it cannot execute code or make purchases).</w:t>
+      </w:r>
+    </w:p>
+    <w:p>
+      <w:pPr>
+        <w:pStyle w:val="ListParagraph"/>
+        <w:numPr>
+          <w:ilvl w:val="0"/>
+          <w:numId w:val="2"/>
+        </w:numPr>
+        <w:spacing w:after="40" w:before="40"/>
+      </w:pPr>
+      <w:r>
+        <w:rPr>
+          <w:rFonts w:ascii="Arial" w:cs="Arial" w:eastAsia="Arial" w:hAnsi="Arial"/>
+          <w:color w:val="595959"/>
+          <w:sz w:val="22"/>
+          <w:szCs w:val="22"/>
+        </w:rPr>
+        <w:t xml:space="preserve">MCP tool exposure follows least-privilege: the Web Researcher agent only has access to search/scrape tools; the Report Writer agent only has access to the Notion write tool.</w:t>
+      </w:r>
+    </w:p>
+    <w:p>
+      <w:pPr>
+        <w:spacing w:after="0" w:before="0"/>
+      </w:pPr>
+      <w:r>
+        <w:rPr>
+          <w:sz w:val="22"/>
+          <w:szCs w:val="22"/>
+        </w:rPr>
+        <w:t xml:space="preserve"/>
+      </w:r>
+    </w:p>
+    <w:p>
+      <w:r>
+        <w:br w:type="page"/>
+      </w:r>
+    </w:p>
+    <w:p>
+      <w:pPr>
+        <w:pStyle w:val="Heading1"/>
+        <w:pBdr>
+          <w:bottom w:val="single" w:color="2E75B6" w:sz="8" w:space="4"/>
+        </w:pBdr>
+        <w:spacing w:after="160" w:before="400"/>
+      </w:pPr>
+      <w:r>
+        <w:rPr>
+          <w:rFonts w:ascii="Arial" w:cs="Arial" w:eastAsia="Arial" w:hAnsi="Arial"/>
+          <w:b/>
+          <w:bCs/>
+          <w:color w:val="1F4E79"/>
+          <w:sz w:val="36"/>
+          <w:szCs w:val="36"/>
+        </w:rPr>
+        <w:t xml:space="preserve">3. System Design</w:t>
+      </w:r>
+    </w:p>
+    <w:p>
+      <w:pPr>
+        <w:pStyle w:val="Heading2"/>
+        <w:spacing w:after="120" w:before="280"/>
+      </w:pPr>
+      <w:r>
+        <w:rPr>
+          <w:rFonts w:ascii="Arial" w:cs="Arial" w:eastAsia="Arial" w:hAnsi="Arial"/>
+          <w:b/>
+          <w:bCs/>
+          <w:color w:val="2E75B6"/>
+          <w:sz w:val="28"/>
+          <w:szCs w:val="28"/>
+        </w:rPr>
+        <w:t xml:space="preserve">3.1 Architecture Overview</w:t>
+      </w:r>
+    </w:p>
+    <w:p>
+      <w:pPr>
+        <w:spacing w:after="60" w:before="60"/>
+      </w:pPr>
+      <w:r>
+        <w:rPr>
+          <w:rFonts w:ascii="Arial" w:cs="Arial" w:eastAsia="Arial" w:hAnsi="Arial"/>
+          <w:color w:val="595959"/>
+          <w:sz w:val="22"/>
+          <w:szCs w:val="22"/>
+        </w:rPr>
+        <w:t xml:space="preserve">ResearchIQ is a multi-agent system orchestrated by LangGraph, exposed via a FastAPI backend, and interacted with through a Streamlit UI. The architecture follows a hub-and-spoke pattern: a Coordinator agent decomposes the user query into sub-tasks and dispatches them in parallel to specialist agents, whose findings are synthesised by a Report Writer agent.</w:t>
+      </w:r>
+    </w:p>
+    <w:p>
+      <w:pPr>
+        <w:spacing w:after="0" w:before="0"/>
+      </w:pPr>
+      <w:r>
+        <w:rPr>
+          <w:sz w:val="22"/>
+          <w:szCs w:val="22"/>
+        </w:rPr>
+        <w:t xml:space="preserve"/>
+      </w:r>
+    </w:p>
+    <w:p>
+      <w:pPr>
+        <w:pStyle w:val="Heading3"/>
+        <w:spacing w:after="80" w:before="200"/>
+      </w:pPr>
+      <w:r>
+        <w:rPr>
+          <w:rFonts w:ascii="Arial" w:cs="Arial" w:eastAsia="Arial" w:hAnsi="Arial"/>
+          <w:b/>
+          <w:bCs/>
+          <w:color w:val="1A1A2E"/>
+          <w:sz w:val="24"/>
+          <w:szCs w:val="24"/>
+        </w:rPr>
+        <w:t xml:space="preserve">3.1.1 Component Overview</w:t>
       </w:r>
     </w:p>
     <w:tbl>
@@ -2693,7 +2905,7 @@
                 <w:sz w:val="20"/>
                 <w:szCs w:val="20"/>
               </w:rPr>
-              <w:t xml:space="preserve">Guardrail</w:t>
+              <w:t xml:space="preserve">Component</w:t>
             </w:r>
           </w:p>
         </w:tc>
@@ -2724,7 +2936,7 @@
                 <w:sz w:val="20"/>
                 <w:szCs w:val="20"/>
               </w:rPr>
-              <w:t xml:space="preserve">Implementation</w:t>
+              <w:t xml:space="preserve">Role</w:t>
             </w:r>
           </w:p>
         </w:tc>
@@ -2757,7 +2969,7 @@
                 <w:sz w:val="20"/>
                 <w:szCs w:val="20"/>
               </w:rPr>
-              <w:t xml:space="preserve">Citation enforcement</w:t>
+              <w:t xml:space="preserve">FastAPI Backend</w:t>
             </w:r>
           </w:p>
         </w:tc>
@@ -2788,7 +3000,7 @@
                 <w:sz w:val="20"/>
                 <w:szCs w:val="20"/>
               </w:rPr>
-              <w:t xml:space="preserve">Report Writer agent is prompted to include a source citation for every factual claim. Claims without traceable sources are marked [UNVERIFIED] and flagged in the report metadata.</w:t>
+              <w:t xml:space="preserve">REST API layer — handles /research and /ingest endpoints, request validation, rate limiting, and streaming responses</w:t>
             </w:r>
           </w:p>
         </w:tc>
@@ -2821,7 +3033,7 @@
                 <w:sz w:val="20"/>
                 <w:szCs w:val="20"/>
               </w:rPr>
-              <w:t xml:space="preserve">Hallucination mitigation</w:t>
+              <w:t xml:space="preserve">LangGraph StateGraph</w:t>
             </w:r>
           </w:p>
         </w:tc>
@@ -2852,7 +3064,7 @@
                 <w:sz w:val="20"/>
                 <w:szCs w:val="20"/>
               </w:rPr>
-              <w:t xml:space="preserve">Retrieved source content is injected directly into the report writer's context window. The prompt explicitly forbids adding information not present in the retrieved sources.</w:t>
+              <w:t xml:space="preserve">Orchestration engine — defines the agent graph, manages shared state (AgentState), and routes execution flow</w:t>
             </w:r>
           </w:p>
         </w:tc>
@@ -2885,7 +3097,7 @@
                 <w:sz w:val="20"/>
                 <w:szCs w:val="20"/>
               </w:rPr>
-              <w:t xml:space="preserve">Confidence scoring</w:t>
+              <w:t xml:space="preserve">Coordinator Agent</w:t>
             </w:r>
           </w:p>
         </w:tc>
@@ -2916,7 +3128,7 @@
                 <w:sz w:val="20"/>
                 <w:szCs w:val="20"/>
               </w:rPr>
-              <w:t xml:space="preserve">Each report section includes a confidence field (High / Medium / Low) based on source count and recency.</w:t>
+              <w:t xml:space="preserve">Query decomposition — uses GPT-4o with structured output (Pydantic) to parse the query into 2-4 focused sub-tasks</w:t>
             </w:r>
           </w:p>
         </w:tc>
@@ -2949,7 +3161,7 @@
                 <w:sz w:val="20"/>
                 <w:szCs w:val="20"/>
               </w:rPr>
-              <w:t xml:space="preserve">Output schema validation</w:t>
+              <w:t xml:space="preserve">Web Researcher Agent</w:t>
             </w:r>
           </w:p>
         </w:tc>
@@ -2980,211 +3192,11 @@
                 <w:sz w:val="20"/>
                 <w:szCs w:val="20"/>
               </w:rPr>
-              <w:t xml:space="preserve">Report Writer produces a Pydantic-validated ResearchReport object. If validation fails, the pipeline retries up to 2 times with a corrective prompt before returning an error.</w:t>
-            </w:r>
-          </w:p>
-        </w:tc>
-      </w:tr>
-    </w:tbl>
-    <w:p>
-      <w:pPr>
-        <w:spacing w:after="0" w:before="0"/>
-      </w:pPr>
-      <w:r>
-        <w:rPr>
-          <w:sz w:val="22"/>
-          <w:szCs w:val="22"/>
-        </w:rPr>
-        <w:t xml:space="preserve"/>
-      </w:r>
-    </w:p>
-    <w:p>
-      <w:pPr>
-        <w:pStyle w:val="Heading3"/>
-        <w:spacing w:after="80" w:before="200"/>
-      </w:pPr>
-      <w:r>
-        <w:rPr>
-          <w:rFonts w:ascii="Arial" w:cs="Arial" w:eastAsia="Arial" w:hAnsi="Arial"/>
-          <w:b/>
-          <w:bCs/>
-          <w:color w:val="1A1A2E"/>
-          <w:sz w:val="24"/>
-          <w:szCs w:val="24"/>
-        </w:rPr>
-        <w:t xml:space="preserve">2.3.3 Model-Level Safety</w:t>
-      </w:r>
-    </w:p>
-    <w:p>
-      <w:pPr>
-        <w:pStyle w:val="ListParagraph"/>
-        <w:numPr>
-          <w:ilvl w:val="0"/>
-          <w:numId w:val="2"/>
-        </w:numPr>
-        <w:spacing w:after="40" w:before="40"/>
-      </w:pPr>
-      <w:r>
-        <w:rPr>
-          <w:rFonts w:ascii="Arial" w:cs="Arial" w:eastAsia="Arial" w:hAnsi="Arial"/>
-          <w:color w:val="595959"/>
-          <w:sz w:val="22"/>
-          <w:szCs w:val="22"/>
-        </w:rPr>
-        <w:t xml:space="preserve">Claude Sonnet 4.6 (primary LLM) includes Anthropic's built-in Constitutional AI safety features, which refuse harmful, deceptive, or dangerous content generation by default.</w:t>
-      </w:r>
-    </w:p>
-    <w:p>
-      <w:pPr>
-        <w:pStyle w:val="ListParagraph"/>
-        <w:numPr>
-          <w:ilvl w:val="0"/>
-          <w:numId w:val="2"/>
-        </w:numPr>
-        <w:spacing w:after="40" w:before="40"/>
-      </w:pPr>
-      <w:r>
-        <w:rPr>
-          <w:rFonts w:ascii="Arial" w:cs="Arial" w:eastAsia="Arial" w:hAnsi="Arial"/>
-          <w:color w:val="595959"/>
-          <w:sz w:val="22"/>
-          <w:szCs w:val="22"/>
-        </w:rPr>
-        <w:t xml:space="preserve">System prompts for each agent explicitly scope the agent's role and restrict off-topic actions (e.g., the Web Researcher agent is instructed to only retrieve and summarise; it cannot execute code or make purchases).</w:t>
-      </w:r>
-    </w:p>
-    <w:p>
-      <w:pPr>
-        <w:pStyle w:val="ListParagraph"/>
-        <w:numPr>
-          <w:ilvl w:val="0"/>
-          <w:numId w:val="2"/>
-        </w:numPr>
-        <w:spacing w:after="40" w:before="40"/>
-      </w:pPr>
-      <w:r>
-        <w:rPr>
-          <w:rFonts w:ascii="Arial" w:cs="Arial" w:eastAsia="Arial" w:hAnsi="Arial"/>
-          <w:color w:val="595959"/>
-          <w:sz w:val="22"/>
-          <w:szCs w:val="22"/>
-        </w:rPr>
-        <w:t xml:space="preserve">MCP tool exposure follows least-privilege: the Web Researcher agent only has access to search/scrape tools; the Report Writer agent only has access to the Notion write tool.</w:t>
-      </w:r>
-    </w:p>
-    <w:p>
-      <w:pPr>
-        <w:spacing w:after="0" w:before="0"/>
-      </w:pPr>
-      <w:r>
-        <w:rPr>
-          <w:sz w:val="22"/>
-          <w:szCs w:val="22"/>
-        </w:rPr>
-        <w:t xml:space="preserve"/>
-      </w:r>
-    </w:p>
-    <w:p>
-      <w:r>
-        <w:br w:type="page"/>
-      </w:r>
-    </w:p>
-    <w:p>
-      <w:pPr>
-        <w:pStyle w:val="Heading1"/>
-        <w:pBdr>
-          <w:bottom w:val="single" w:color="2E75B6" w:sz="8" w:space="4"/>
-        </w:pBdr>
-        <w:spacing w:after="160" w:before="400"/>
-      </w:pPr>
-      <w:r>
-        <w:rPr>
-          <w:rFonts w:ascii="Arial" w:cs="Arial" w:eastAsia="Arial" w:hAnsi="Arial"/>
-          <w:b/>
-          <w:bCs/>
-          <w:color w:val="1F4E79"/>
-          <w:sz w:val="36"/>
-          <w:szCs w:val="36"/>
-        </w:rPr>
-        <w:t xml:space="preserve">3. System Design</w:t>
-      </w:r>
-    </w:p>
-    <w:p>
-      <w:pPr>
-        <w:pStyle w:val="Heading2"/>
-        <w:spacing w:after="120" w:before="280"/>
-      </w:pPr>
-      <w:r>
-        <w:rPr>
-          <w:rFonts w:ascii="Arial" w:cs="Arial" w:eastAsia="Arial" w:hAnsi="Arial"/>
-          <w:b/>
-          <w:bCs/>
-          <w:color w:val="2E75B6"/>
-          <w:sz w:val="28"/>
-          <w:szCs w:val="28"/>
-        </w:rPr>
-        <w:t xml:space="preserve">3.1 Architecture Overview</w:t>
-      </w:r>
-    </w:p>
-    <w:p>
-      <w:pPr>
-        <w:spacing w:after="60" w:before="60"/>
-      </w:pPr>
-      <w:r>
-        <w:rPr>
-          <w:rFonts w:ascii="Arial" w:cs="Arial" w:eastAsia="Arial" w:hAnsi="Arial"/>
-          <w:color w:val="595959"/>
-          <w:sz w:val="22"/>
-          <w:szCs w:val="22"/>
-        </w:rPr>
-        <w:t xml:space="preserve">ResearchIQ is a multi-agent system orchestrated by LangGraph, exposed via a FastAPI backend, and interacted with through a Streamlit UI. The architecture follows a hub-and-spoke pattern: a Coordinator agent decomposes the user query into sub-tasks and dispatches them in parallel to specialist agents, whose findings are synthesised by a Report Writer agent.</w:t>
-      </w:r>
-    </w:p>
-    <w:p>
-      <w:pPr>
-        <w:spacing w:after="0" w:before="0"/>
-      </w:pPr>
-      <w:r>
-        <w:rPr>
-          <w:sz w:val="22"/>
-          <w:szCs w:val="22"/>
-        </w:rPr>
-        <w:t xml:space="preserve"/>
-      </w:r>
-    </w:p>
-    <w:p>
-      <w:pPr>
-        <w:pStyle w:val="Heading3"/>
-        <w:spacing w:after="80" w:before="200"/>
-      </w:pPr>
-      <w:r>
-        <w:rPr>
-          <w:rFonts w:ascii="Arial" w:cs="Arial" w:eastAsia="Arial" w:hAnsi="Arial"/>
-          <w:b/>
-          <w:bCs/>
-          <w:color w:val="1A1A2E"/>
-          <w:sz w:val="24"/>
-          <w:szCs w:val="24"/>
-        </w:rPr>
-        <w:t xml:space="preserve">3.1.1 Component Overview</w:t>
-      </w:r>
-    </w:p>
-    <w:tbl>
-      <w:tblPr>
-        <w:tblW w:type="dxa" w:w="9360"/>
-        <w:tblBorders>
-          <w:top w:val="single" w:color="auto" w:sz="4"/>
-          <w:left w:val="single" w:color="auto" w:sz="4"/>
-          <w:bottom w:val="single" w:color="auto" w:sz="4"/>
-          <w:right w:val="single" w:color="auto" w:sz="4"/>
-          <w:insideH w:val="single" w:color="auto" w:sz="4"/>
-          <w:insideV w:val="single" w:color="auto" w:sz="4"/>
-        </w:tblBorders>
-      </w:tblPr>
-      <w:tblGrid>
-        <w:gridCol w:w="2800"/>
-        <w:gridCol w:w="6560"/>
-      </w:tblGrid>
+              <w:t xml:space="preserve">Live retrieval — ReAct agent with Tavily MCP, ArXiv, Wikipedia, and scraper tools; runs one instance per sub-task in parallel</w:t>
+            </w:r>
+          </w:p>
+        </w:tc>
+      </w:tr>
       <w:tr>
         <w:tc>
           <w:tcPr>
@@ -3195,25 +3207,25 @@
               <w:bottom w:val="single" w:color="CCCCCC" w:sz="1"/>
               <w:right w:val="single" w:color="CCCCCC" w:sz="1"/>
             </w:tcBorders>
-            <w:shd w:fill="2E75B6" w:val="clear"/>
-            <w:tcMar>
-              <w:top w:type="dxa" w:w="80"/>
-              <w:left w:type="dxa" w:w="120"/>
-              <w:bottom w:type="dxa" w:w="80"/>
-              <w:right w:type="dxa" w:w="120"/>
-            </w:tcMar>
-          </w:tcPr>
-          <w:p>
-            <w:r>
-              <w:rPr>
-                <w:rFonts w:ascii="Arial" w:cs="Arial" w:eastAsia="Arial" w:hAnsi="Arial"/>
-                <w:b/>
-                <w:bCs/>
-                <w:color w:val="FFFFFF"/>
-                <w:sz w:val="20"/>
-                <w:szCs w:val="20"/>
-              </w:rPr>
-              <w:t xml:space="preserve">Component</w:t>
+            <w:shd w:fill="FFFFFF" w:val="clear"/>
+            <w:tcMar>
+              <w:top w:type="dxa" w:w="80"/>
+              <w:left w:type="dxa" w:w="120"/>
+              <w:bottom w:type="dxa" w:w="80"/>
+              <w:right w:type="dxa" w:w="120"/>
+            </w:tcMar>
+          </w:tcPr>
+          <w:p>
+            <w:r>
+              <w:rPr>
+                <w:rFonts w:ascii="Arial" w:cs="Arial" w:eastAsia="Arial" w:hAnsi="Arial"/>
+                <w:b w:val="false"/>
+                <w:bCs w:val="false"/>
+                <w:color w:val="595959"/>
+                <w:sz w:val="20"/>
+                <w:szCs w:val="20"/>
+              </w:rPr>
+              <w:t xml:space="preserve">Document Analyst Agent</w:t>
             </w:r>
           </w:p>
         </w:tc>
@@ -3226,25 +3238,25 @@
               <w:bottom w:val="single" w:color="CCCCCC" w:sz="1"/>
               <w:right w:val="single" w:color="CCCCCC" w:sz="1"/>
             </w:tcBorders>
-            <w:shd w:fill="2E75B6" w:val="clear"/>
-            <w:tcMar>
-              <w:top w:type="dxa" w:w="80"/>
-              <w:left w:type="dxa" w:w="120"/>
-              <w:bottom w:type="dxa" w:w="80"/>
-              <w:right w:type="dxa" w:w="120"/>
-            </w:tcMar>
-          </w:tcPr>
-          <w:p>
-            <w:r>
-              <w:rPr>
-                <w:rFonts w:ascii="Arial" w:cs="Arial" w:eastAsia="Arial" w:hAnsi="Arial"/>
-                <w:b/>
-                <w:bCs/>
-                <w:color w:val="FFFFFF"/>
-                <w:sz w:val="20"/>
-                <w:szCs w:val="20"/>
-              </w:rPr>
-              <w:t xml:space="preserve">Role</w:t>
+            <w:shd w:fill="F2F2F2" w:val="clear"/>
+            <w:tcMar>
+              <w:top w:type="dxa" w:w="80"/>
+              <w:left w:type="dxa" w:w="120"/>
+              <w:bottom w:type="dxa" w:w="80"/>
+              <w:right w:type="dxa" w:w="120"/>
+            </w:tcMar>
+          </w:tcPr>
+          <w:p>
+            <w:r>
+              <w:rPr>
+                <w:rFonts w:ascii="Arial" w:cs="Arial" w:eastAsia="Arial" w:hAnsi="Arial"/>
+                <w:b w:val="false"/>
+                <w:bCs w:val="false"/>
+                <w:color w:val="595959"/>
+                <w:sz w:val="20"/>
+                <w:szCs w:val="20"/>
+              </w:rPr>
+              <w:t xml:space="preserve">Knowledge base retrieval — ReAct agent with hybrid RAG tools; runs one instance per sub-task in parallel</w:t>
             </w:r>
           </w:p>
         </w:tc>
@@ -3277,7 +3289,7 @@
                 <w:sz w:val="20"/>
                 <w:szCs w:val="20"/>
               </w:rPr>
-              <w:t xml:space="preserve">FastAPI Backend</w:t>
+              <w:t xml:space="preserve">Report Writer Agent</w:t>
             </w:r>
           </w:p>
         </w:tc>
@@ -3308,7 +3320,7 @@
                 <w:sz w:val="20"/>
                 <w:szCs w:val="20"/>
               </w:rPr>
-              <w:t xml:space="preserve">REST API layer — handles /research and /ingest endpoints, request validation, rate limiting, and streaming responses</w:t>
+              <w:t xml:space="preserve">Synthesis — combines all findings into a structured ResearchReport; saves to Notion via MCP</w:t>
             </w:r>
           </w:p>
         </w:tc>
@@ -3341,7 +3353,7 @@
                 <w:sz w:val="20"/>
                 <w:szCs w:val="20"/>
               </w:rPr>
-              <w:t xml:space="preserve">LangGraph StateGraph</w:t>
+              <w:t xml:space="preserve">Qdrant Vector Store</w:t>
             </w:r>
           </w:p>
         </w:tc>
@@ -3372,7 +3384,7 @@
                 <w:sz w:val="20"/>
                 <w:szCs w:val="20"/>
               </w:rPr>
-              <w:t xml:space="preserve">Orchestration engine — defines the agent graph, manages shared state (AgentState), and routes execution flow</w:t>
+              <w:t xml:space="preserve">Dense vector index for semantic retrieval of knowledge base chunks</w:t>
             </w:r>
           </w:p>
         </w:tc>
@@ -3405,7 +3417,7 @@
                 <w:sz w:val="20"/>
                 <w:szCs w:val="20"/>
               </w:rPr>
-              <w:t xml:space="preserve">Coordinator Agent</w:t>
+              <w:t xml:space="preserve">BM25 Index</w:t>
             </w:r>
           </w:p>
         </w:tc>
@@ -3436,7 +3448,7 @@
                 <w:sz w:val="20"/>
                 <w:szCs w:val="20"/>
               </w:rPr>
-              <w:t xml:space="preserve">Query decomposition — uses Claude Sonnet 4.6 with structured output (Pydantic) to parse the query into 2-4 focused sub-tasks</w:t>
+              <w:t xml:space="preserve">Sparse keyword index for lexical retrieval; fused with Qdrant via RRF</w:t>
             </w:r>
           </w:p>
         </w:tc>
@@ -3469,7 +3481,7 @@
                 <w:sz w:val="20"/>
                 <w:szCs w:val="20"/>
               </w:rPr>
-              <w:t xml:space="preserve">Web Researcher Agent</w:t>
+              <w:t xml:space="preserve">Tavily MCP Server</w:t>
             </w:r>
           </w:p>
         </w:tc>
@@ -3500,7 +3512,7 @@
                 <w:sz w:val="20"/>
                 <w:szCs w:val="20"/>
               </w:rPr>
-              <w:t xml:space="preserve">Live retrieval — ReAct agent with Tavily MCP, ArXiv, Wikipedia, and scraper tools; runs one instance per sub-task in parallel</w:t>
+              <w:t xml:space="preserve">Custom MCP server exposing web_search() and get_page_content() tools</w:t>
             </w:r>
           </w:p>
         </w:tc>
@@ -3533,7 +3545,7 @@
                 <w:sz w:val="20"/>
                 <w:szCs w:val="20"/>
               </w:rPr>
-              <w:t xml:space="preserve">Document Analyst Agent</w:t>
+              <w:t xml:space="preserve">Notion MCP Server</w:t>
             </w:r>
           </w:p>
         </w:tc>
@@ -3564,7 +3576,7 @@
                 <w:sz w:val="20"/>
                 <w:szCs w:val="20"/>
               </w:rPr>
-              <w:t xml:space="preserve">Knowledge base retrieval — ReAct agent with hybrid RAG tools; runs one instance per sub-task in parallel</w:t>
+              <w:t xml:space="preserve">MCP server exposing create_page() and append_block() for report persistence</w:t>
             </w:r>
           </w:p>
         </w:tc>
@@ -3597,7 +3609,7 @@
                 <w:sz w:val="20"/>
                 <w:szCs w:val="20"/>
               </w:rPr>
-              <w:t xml:space="preserve">Report Writer Agent</w:t>
+              <w:t xml:space="preserve">LangSmith</w:t>
             </w:r>
           </w:p>
         </w:tc>
@@ -3628,327 +3640,7 @@
                 <w:sz w:val="20"/>
                 <w:szCs w:val="20"/>
               </w:rPr>
-              <w:t xml:space="preserve">Synthesis — combines all findings into a structured ResearchReport; saves to Notion via MCP</w:t>
-            </w:r>
-          </w:p>
-        </w:tc>
-      </w:tr>
-      <w:tr>
-        <w:tc>
-          <w:tcPr>
-            <w:tcW w:type="dxa" w:w="2800"/>
-            <w:tcBorders>
-              <w:top w:val="single" w:color="CCCCCC" w:sz="1"/>
-              <w:left w:val="single" w:color="CCCCCC" w:sz="1"/>
-              <w:bottom w:val="single" w:color="CCCCCC" w:sz="1"/>
-              <w:right w:val="single" w:color="CCCCCC" w:sz="1"/>
-            </w:tcBorders>
-            <w:shd w:fill="FFFFFF" w:val="clear"/>
-            <w:tcMar>
-              <w:top w:type="dxa" w:w="80"/>
-              <w:left w:type="dxa" w:w="120"/>
-              <w:bottom w:type="dxa" w:w="80"/>
-              <w:right w:type="dxa" w:w="120"/>
-            </w:tcMar>
-          </w:tcPr>
-          <w:p>
-            <w:r>
-              <w:rPr>
-                <w:rFonts w:ascii="Arial" w:cs="Arial" w:eastAsia="Arial" w:hAnsi="Arial"/>
-                <w:b w:val="false"/>
-                <w:bCs w:val="false"/>
-                <w:color w:val="595959"/>
-                <w:sz w:val="20"/>
-                <w:szCs w:val="20"/>
-              </w:rPr>
-              <w:t xml:space="preserve">Qdrant Vector Store</w:t>
-            </w:r>
-          </w:p>
-        </w:tc>
-        <w:tc>
-          <w:tcPr>
-            <w:tcW w:type="dxa" w:w="6560"/>
-            <w:tcBorders>
-              <w:top w:val="single" w:color="CCCCCC" w:sz="1"/>
-              <w:left w:val="single" w:color="CCCCCC" w:sz="1"/>
-              <w:bottom w:val="single" w:color="CCCCCC" w:sz="1"/>
-              <w:right w:val="single" w:color="CCCCCC" w:sz="1"/>
-            </w:tcBorders>
-            <w:shd w:fill="F2F2F2" w:val="clear"/>
-            <w:tcMar>
-              <w:top w:type="dxa" w:w="80"/>
-              <w:left w:type="dxa" w:w="120"/>
-              <w:bottom w:type="dxa" w:w="80"/>
-              <w:right w:type="dxa" w:w="120"/>
-            </w:tcMar>
-          </w:tcPr>
-          <w:p>
-            <w:r>
-              <w:rPr>
-                <w:rFonts w:ascii="Arial" w:cs="Arial" w:eastAsia="Arial" w:hAnsi="Arial"/>
-                <w:b w:val="false"/>
-                <w:bCs w:val="false"/>
-                <w:color w:val="595959"/>
-                <w:sz w:val="20"/>
-                <w:szCs w:val="20"/>
-              </w:rPr>
-              <w:t xml:space="preserve">Dense vector index for semantic retrieval of knowledge base chunks</w:t>
-            </w:r>
-          </w:p>
-        </w:tc>
-      </w:tr>
-      <w:tr>
-        <w:tc>
-          <w:tcPr>
-            <w:tcW w:type="dxa" w:w="2800"/>
-            <w:tcBorders>
-              <w:top w:val="single" w:color="CCCCCC" w:sz="1"/>
-              <w:left w:val="single" w:color="CCCCCC" w:sz="1"/>
-              <w:bottom w:val="single" w:color="CCCCCC" w:sz="1"/>
-              <w:right w:val="single" w:color="CCCCCC" w:sz="1"/>
-            </w:tcBorders>
-            <w:shd w:fill="FFFFFF" w:val="clear"/>
-            <w:tcMar>
-              <w:top w:type="dxa" w:w="80"/>
-              <w:left w:type="dxa" w:w="120"/>
-              <w:bottom w:type="dxa" w:w="80"/>
-              <w:right w:type="dxa" w:w="120"/>
-            </w:tcMar>
-          </w:tcPr>
-          <w:p>
-            <w:r>
-              <w:rPr>
-                <w:rFonts w:ascii="Arial" w:cs="Arial" w:eastAsia="Arial" w:hAnsi="Arial"/>
-                <w:b w:val="false"/>
-                <w:bCs w:val="false"/>
-                <w:color w:val="595959"/>
-                <w:sz w:val="20"/>
-                <w:szCs w:val="20"/>
-              </w:rPr>
-              <w:t xml:space="preserve">BM25 Index</w:t>
-            </w:r>
-          </w:p>
-        </w:tc>
-        <w:tc>
-          <w:tcPr>
-            <w:tcW w:type="dxa" w:w="6560"/>
-            <w:tcBorders>
-              <w:top w:val="single" w:color="CCCCCC" w:sz="1"/>
-              <w:left w:val="single" w:color="CCCCCC" w:sz="1"/>
-              <w:bottom w:val="single" w:color="CCCCCC" w:sz="1"/>
-              <w:right w:val="single" w:color="CCCCCC" w:sz="1"/>
-            </w:tcBorders>
-            <w:shd w:fill="F2F2F2" w:val="clear"/>
-            <w:tcMar>
-              <w:top w:type="dxa" w:w="80"/>
-              <w:left w:type="dxa" w:w="120"/>
-              <w:bottom w:type="dxa" w:w="80"/>
-              <w:right w:type="dxa" w:w="120"/>
-            </w:tcMar>
-          </w:tcPr>
-          <w:p>
-            <w:r>
-              <w:rPr>
-                <w:rFonts w:ascii="Arial" w:cs="Arial" w:eastAsia="Arial" w:hAnsi="Arial"/>
-                <w:b w:val="false"/>
-                <w:bCs w:val="false"/>
-                <w:color w:val="595959"/>
-                <w:sz w:val="20"/>
-                <w:szCs w:val="20"/>
-              </w:rPr>
-              <w:t xml:space="preserve">Sparse keyword index for lexical retrieval; fused with Qdrant via RRF</w:t>
-            </w:r>
-          </w:p>
-        </w:tc>
-      </w:tr>
-      <w:tr>
-        <w:tc>
-          <w:tcPr>
-            <w:tcW w:type="dxa" w:w="2800"/>
-            <w:tcBorders>
-              <w:top w:val="single" w:color="CCCCCC" w:sz="1"/>
-              <w:left w:val="single" w:color="CCCCCC" w:sz="1"/>
-              <w:bottom w:val="single" w:color="CCCCCC" w:sz="1"/>
-              <w:right w:val="single" w:color="CCCCCC" w:sz="1"/>
-            </w:tcBorders>
-            <w:shd w:fill="FFFFFF" w:val="clear"/>
-            <w:tcMar>
-              <w:top w:type="dxa" w:w="80"/>
-              <w:left w:type="dxa" w:w="120"/>
-              <w:bottom w:type="dxa" w:w="80"/>
-              <w:right w:type="dxa" w:w="120"/>
-            </w:tcMar>
-          </w:tcPr>
-          <w:p>
-            <w:r>
-              <w:rPr>
-                <w:rFonts w:ascii="Arial" w:cs="Arial" w:eastAsia="Arial" w:hAnsi="Arial"/>
-                <w:b w:val="false"/>
-                <w:bCs w:val="false"/>
-                <w:color w:val="595959"/>
-                <w:sz w:val="20"/>
-                <w:szCs w:val="20"/>
-              </w:rPr>
-              <w:t xml:space="preserve">Tavily MCP Server</w:t>
-            </w:r>
-          </w:p>
-        </w:tc>
-        <w:tc>
-          <w:tcPr>
-            <w:tcW w:type="dxa" w:w="6560"/>
-            <w:tcBorders>
-              <w:top w:val="single" w:color="CCCCCC" w:sz="1"/>
-              <w:left w:val="single" w:color="CCCCCC" w:sz="1"/>
-              <w:bottom w:val="single" w:color="CCCCCC" w:sz="1"/>
-              <w:right w:val="single" w:color="CCCCCC" w:sz="1"/>
-            </w:tcBorders>
-            <w:shd w:fill="F2F2F2" w:val="clear"/>
-            <w:tcMar>
-              <w:top w:type="dxa" w:w="80"/>
-              <w:left w:type="dxa" w:w="120"/>
-              <w:bottom w:type="dxa" w:w="80"/>
-              <w:right w:type="dxa" w:w="120"/>
-            </w:tcMar>
-          </w:tcPr>
-          <w:p>
-            <w:r>
-              <w:rPr>
-                <w:rFonts w:ascii="Arial" w:cs="Arial" w:eastAsia="Arial" w:hAnsi="Arial"/>
-                <w:b w:val="false"/>
-                <w:bCs w:val="false"/>
-                <w:color w:val="595959"/>
-                <w:sz w:val="20"/>
-                <w:szCs w:val="20"/>
-              </w:rPr>
-              <w:t xml:space="preserve">Custom MCP server exposing web_search() and get_page_content() tools</w:t>
-            </w:r>
-          </w:p>
-        </w:tc>
-      </w:tr>
-      <w:tr>
-        <w:tc>
-          <w:tcPr>
-            <w:tcW w:type="dxa" w:w="2800"/>
-            <w:tcBorders>
-              <w:top w:val="single" w:color="CCCCCC" w:sz="1"/>
-              <w:left w:val="single" w:color="CCCCCC" w:sz="1"/>
-              <w:bottom w:val="single" w:color="CCCCCC" w:sz="1"/>
-              <w:right w:val="single" w:color="CCCCCC" w:sz="1"/>
-            </w:tcBorders>
-            <w:shd w:fill="FFFFFF" w:val="clear"/>
-            <w:tcMar>
-              <w:top w:type="dxa" w:w="80"/>
-              <w:left w:type="dxa" w:w="120"/>
-              <w:bottom w:type="dxa" w:w="80"/>
-              <w:right w:type="dxa" w:w="120"/>
-            </w:tcMar>
-          </w:tcPr>
-          <w:p>
-            <w:r>
-              <w:rPr>
-                <w:rFonts w:ascii="Arial" w:cs="Arial" w:eastAsia="Arial" w:hAnsi="Arial"/>
-                <w:b w:val="false"/>
-                <w:bCs w:val="false"/>
-                <w:color w:val="595959"/>
-                <w:sz w:val="20"/>
-                <w:szCs w:val="20"/>
-              </w:rPr>
-              <w:t xml:space="preserve">Notion MCP Server</w:t>
-            </w:r>
-          </w:p>
-        </w:tc>
-        <w:tc>
-          <w:tcPr>
-            <w:tcW w:type="dxa" w:w="6560"/>
-            <w:tcBorders>
-              <w:top w:val="single" w:color="CCCCCC" w:sz="1"/>
-              <w:left w:val="single" w:color="CCCCCC" w:sz="1"/>
-              <w:bottom w:val="single" w:color="CCCCCC" w:sz="1"/>
-              <w:right w:val="single" w:color="CCCCCC" w:sz="1"/>
-            </w:tcBorders>
-            <w:shd w:fill="F2F2F2" w:val="clear"/>
-            <w:tcMar>
-              <w:top w:type="dxa" w:w="80"/>
-              <w:left w:type="dxa" w:w="120"/>
-              <w:bottom w:type="dxa" w:w="80"/>
-              <w:right w:type="dxa" w:w="120"/>
-            </w:tcMar>
-          </w:tcPr>
-          <w:p>
-            <w:r>
-              <w:rPr>
-                <w:rFonts w:ascii="Arial" w:cs="Arial" w:eastAsia="Arial" w:hAnsi="Arial"/>
-                <w:b w:val="false"/>
-                <w:bCs w:val="false"/>
-                <w:color w:val="595959"/>
-                <w:sz w:val="20"/>
-                <w:szCs w:val="20"/>
-              </w:rPr>
-              <w:t xml:space="preserve">MCP server exposing create_page() and append_block() for report persistence</w:t>
-            </w:r>
-          </w:p>
-        </w:tc>
-      </w:tr>
-      <w:tr>
-        <w:tc>
-          <w:tcPr>
-            <w:tcW w:type="dxa" w:w="2800"/>
-            <w:tcBorders>
-              <w:top w:val="single" w:color="CCCCCC" w:sz="1"/>
-              <w:left w:val="single" w:color="CCCCCC" w:sz="1"/>
-              <w:bottom w:val="single" w:color="CCCCCC" w:sz="1"/>
-              <w:right w:val="single" w:color="CCCCCC" w:sz="1"/>
-            </w:tcBorders>
-            <w:shd w:fill="FFFFFF" w:val="clear"/>
-            <w:tcMar>
-              <w:top w:type="dxa" w:w="80"/>
-              <w:left w:type="dxa" w:w="120"/>
-              <w:bottom w:type="dxa" w:w="80"/>
-              <w:right w:type="dxa" w:w="120"/>
-            </w:tcMar>
-          </w:tcPr>
-          <w:p>
-            <w:r>
-              <w:rPr>
-                <w:rFonts w:ascii="Arial" w:cs="Arial" w:eastAsia="Arial" w:hAnsi="Arial"/>
-                <w:b w:val="false"/>
-                <w:bCs w:val="false"/>
-                <w:color w:val="595959"/>
-                <w:sz w:val="20"/>
-                <w:szCs w:val="20"/>
-              </w:rPr>
-              <w:t xml:space="preserve">LangSmith + Langfuse</w:t>
-            </w:r>
-          </w:p>
-        </w:tc>
-        <w:tc>
-          <w:tcPr>
-            <w:tcW w:type="dxa" w:w="6560"/>
-            <w:tcBorders>
-              <w:top w:val="single" w:color="CCCCCC" w:sz="1"/>
-              <w:left w:val="single" w:color="CCCCCC" w:sz="1"/>
-              <w:bottom w:val="single" w:color="CCCCCC" w:sz="1"/>
-              <w:right w:val="single" w:color="CCCCCC" w:sz="1"/>
-            </w:tcBorders>
-            <w:shd w:fill="F2F2F2" w:val="clear"/>
-            <w:tcMar>
-              <w:top w:type="dxa" w:w="80"/>
-              <w:left w:type="dxa" w:w="120"/>
-              <w:bottom w:type="dxa" w:w="80"/>
-              <w:right w:type="dxa" w:w="120"/>
-            </w:tcMar>
-          </w:tcPr>
-          <w:p>
-            <w:r>
-              <w:rPr>
-                <w:rFonts w:ascii="Arial" w:cs="Arial" w:eastAsia="Arial" w:hAnsi="Arial"/>
-                <w:b w:val="false"/>
-                <w:bCs w:val="false"/>
-                <w:color w:val="595959"/>
-                <w:sz w:val="20"/>
-                <w:szCs w:val="20"/>
-              </w:rPr>
-              <w:t xml:space="preserve">Observability — distributed tracing, LLM call logging, latency and cost monitoring</w:t>
+              <w:t xml:space="preserve">Observability — distributed tracing, per-node latency, LLM call logging, cost monitoring</w:t>
             </w:r>
           </w:p>
         </w:tc>
@@ -4696,7 +4388,7 @@
                 <w:sz w:val="20"/>
                 <w:szCs w:val="20"/>
               </w:rPr>
-              <w:t xml:space="preserve">Claude Sonnet 4.6</w:t>
+              <w:t xml:space="preserve">GPT-4o</w:t>
             </w:r>
           </w:p>
         </w:tc>
@@ -4727,7 +4419,7 @@
                 <w:sz w:val="20"/>
                 <w:szCs w:val="20"/>
               </w:rPr>
-              <w:t xml:space="preserve">Best-in-class reasoning; structured output; 200K context window for synthesis</w:t>
+              <w:t xml:space="preserve">Strong reasoning and structured output; broad tool-calling support; reliable availability SLA</w:t>
             </w:r>
           </w:p>
         </w:tc>
@@ -4791,7 +4483,7 @@
                 <w:sz w:val="20"/>
                 <w:szCs w:val="20"/>
               </w:rPr>
-              <w:t xml:space="preserve">GPT-4o</w:t>
+              <w:t xml:space="preserve">GPT-4o-mini</w:t>
             </w:r>
           </w:p>
         </w:tc>
@@ -4822,7 +4514,7 @@
                 <w:sz w:val="20"/>
                 <w:szCs w:val="20"/>
               </w:rPr>
-              <w:t xml:space="preserve">Redundancy for LLM API outages; similar capability profile</w:t>
+              <w:t xml:space="preserve">Cost-effective fallback for simpler sub-tasks and retries; same provider reduces integration overhead</w:t>
             </w:r>
           </w:p>
         </w:tc>
@@ -5741,7 +5433,7 @@
                 <w:sz w:val="20"/>
                 <w:szCs w:val="20"/>
               </w:rPr>
-              <w:t xml:space="preserve">LangSmith + Langfuse</w:t>
+              <w:t xml:space="preserve">LangSmith</w:t>
             </w:r>
           </w:p>
         </w:tc>
@@ -5772,7 +5464,7 @@
                 <w:sz w:val="20"/>
                 <w:szCs w:val="20"/>
               </w:rPr>
-              <w:t xml:space="preserve">Distributed tracing + cost/latency dashboards; complementary feature sets</w:t>
+              <w:t xml:space="preserve">Native LangGraph integration; full distributed tracing, per-node latency, token cost tracking</w:t>
             </w:r>
           </w:p>
         </w:tc>
@@ -6282,7 +5974,7 @@
                 <w:sz w:val="20"/>
                 <w:szCs w:val="20"/>
               </w:rPr>
-              <w:t xml:space="preserve">Claude Sonnet 4.6 (primary) + GPT-4o (fallback)</w:t>
+              <w:t xml:space="preserve">GPT-4o (primary) + GPT-4o-mini (fallback)</w:t>
             </w:r>
           </w:p>
         </w:tc>
@@ -6313,7 +6005,7 @@
                 <w:sz w:val="20"/>
                 <w:szCs w:val="20"/>
               </w:rPr>
-              <w:t xml:space="preserve">Higher cost per token vs. using a single cheaper model; justified by synthesis quality requirements and availability SLA</w:t>
+              <w:t xml:space="preserve">Both from same provider — simplifies auth/billing; GPT-4o-mini is significantly cheaper for retries and simple sub-tasks</w:t>
             </w:r>
           </w:p>
         </w:tc>
@@ -6503,7 +6195,7 @@
                 <w:sz w:val="20"/>
                 <w:szCs w:val="20"/>
               </w:rPr>
-              <w:t xml:space="preserve">Operational overhead vs. managed service (Pinecone, Weaviate Cloud); justified by cost control in a capstone context and local iteration speed</w:t>
+              <w:t xml:space="preserve">Operational overhead vs. managed service (Pinecone, Weaviate Cloud); justified by cost control and local iteration speed</w:t>
             </w:r>
           </w:p>
         </w:tc>
@@ -6598,7 +6290,7 @@
                 <w:sz w:val="20"/>
                 <w:szCs w:val="20"/>
               </w:rPr>
-              <w:t xml:space="preserve">Dependency on Notion API availability vs. saving to local filesystem; justified by richer formatting, sharability, and real-world relevance</w:t>
+              <w:t xml:space="preserve">Dependency on Notion API availability vs. local filesystem; justified by richer formatting, sharability, and real-world relevance</w:t>
             </w:r>
           </w:p>
         </w:tc>
@@ -6694,6 +6386,101 @@
                 <w:szCs w:val="20"/>
               </w:rPr>
               <w:t xml:space="preserve">Higher ingestion cost (requires embedding during chunking) vs. character-level splitting; justified by significantly better chunk boundary quality</w:t>
+            </w:r>
+          </w:p>
+        </w:tc>
+      </w:tr>
+      <w:tr>
+        <w:tc>
+          <w:tcPr>
+            <w:tcW w:type="dxa" w:w="2400"/>
+            <w:tcBorders>
+              <w:top w:val="single" w:color="CCCCCC" w:sz="1"/>
+              <w:left w:val="single" w:color="CCCCCC" w:sz="1"/>
+              <w:bottom w:val="single" w:color="CCCCCC" w:sz="1"/>
+              <w:right w:val="single" w:color="CCCCCC" w:sz="1"/>
+            </w:tcBorders>
+            <w:shd w:fill="FFFFFF" w:val="clear"/>
+            <w:tcMar>
+              <w:top w:type="dxa" w:w="80"/>
+              <w:left w:type="dxa" w:w="120"/>
+              <w:bottom w:type="dxa" w:w="80"/>
+              <w:right w:type="dxa" w:w="120"/>
+            </w:tcMar>
+          </w:tcPr>
+          <w:p>
+            <w:r>
+              <w:rPr>
+                <w:rFonts w:ascii="Arial" w:cs="Arial" w:eastAsia="Arial" w:hAnsi="Arial"/>
+                <w:b w:val="false"/>
+                <w:bCs w:val="false"/>
+                <w:color w:val="595959"/>
+                <w:sz w:val="20"/>
+                <w:szCs w:val="20"/>
+              </w:rPr>
+              <w:t xml:space="preserve">Observability</w:t>
+            </w:r>
+          </w:p>
+        </w:tc>
+        <w:tc>
+          <w:tcPr>
+            <w:tcW w:type="dxa" w:w="3780"/>
+            <w:tcBorders>
+              <w:top w:val="single" w:color="CCCCCC" w:sz="1"/>
+              <w:left w:val="single" w:color="CCCCCC" w:sz="1"/>
+              <w:bottom w:val="single" w:color="CCCCCC" w:sz="1"/>
+              <w:right w:val="single" w:color="CCCCCC" w:sz="1"/>
+            </w:tcBorders>
+            <w:shd w:fill="FFFFFF" w:val="clear"/>
+            <w:tcMar>
+              <w:top w:type="dxa" w:w="80"/>
+              <w:left w:type="dxa" w:w="120"/>
+              <w:bottom w:type="dxa" w:w="80"/>
+              <w:right w:type="dxa" w:w="120"/>
+            </w:tcMar>
+          </w:tcPr>
+          <w:p>
+            <w:r>
+              <w:rPr>
+                <w:rFonts w:ascii="Arial" w:cs="Arial" w:eastAsia="Arial" w:hAnsi="Arial"/>
+                <w:b w:val="false"/>
+                <w:bCs w:val="false"/>
+                <w:color w:val="595959"/>
+                <w:sz w:val="20"/>
+                <w:szCs w:val="20"/>
+              </w:rPr>
+              <w:t xml:space="preserve">LangSmith only</w:t>
+            </w:r>
+          </w:p>
+        </w:tc>
+        <w:tc>
+          <w:tcPr>
+            <w:tcW w:type="dxa" w:w="3180"/>
+            <w:tcBorders>
+              <w:top w:val="single" w:color="CCCCCC" w:sz="1"/>
+              <w:left w:val="single" w:color="CCCCCC" w:sz="1"/>
+              <w:bottom w:val="single" w:color="CCCCCC" w:sz="1"/>
+              <w:right w:val="single" w:color="CCCCCC" w:sz="1"/>
+            </w:tcBorders>
+            <w:shd w:fill="F2F2F2" w:val="clear"/>
+            <w:tcMar>
+              <w:top w:type="dxa" w:w="80"/>
+              <w:left w:type="dxa" w:w="120"/>
+              <w:bottom w:type="dxa" w:w="80"/>
+              <w:right w:type="dxa" w:w="120"/>
+            </w:tcMar>
+          </w:tcPr>
+          <w:p>
+            <w:r>
+              <w:rPr>
+                <w:rFonts w:ascii="Arial" w:cs="Arial" w:eastAsia="Arial" w:hAnsi="Arial"/>
+                <w:b w:val="false"/>
+                <w:bCs w:val="false"/>
+                <w:color w:val="595959"/>
+                <w:sz w:val="20"/>
+                <w:szCs w:val="20"/>
+              </w:rPr>
+              <w:t xml:space="preserve">Single tool vs. pairing with Langfuse; LangSmith's native LangGraph integration provides sufficient tracing, latency, and cost visibility without added operational complexity</w:t>
             </w:r>
           </w:p>
         </w:tc>
@@ -8127,7 +7914,7 @@
                 <w:sz w:val="20"/>
                 <w:szCs w:val="20"/>
               </w:rPr>
-              <w:t xml:space="preserve">Claude API timeout / 5xx</w:t>
+              <w:t xml:space="preserve">GPT-4o API timeout / 5xx</w:t>
             </w:r>
           </w:p>
         </w:tc>
@@ -8158,7 +7945,7 @@
                 <w:sz w:val="20"/>
                 <w:szCs w:val="20"/>
               </w:rPr>
-              <w:t xml:space="preserve">Retry up to 3x with exponential backoff (tenacity); fallback to GPT-4o on 3rd failure</w:t>
+              <w:t xml:space="preserve">Retry up to 3x with exponential backoff (tenacity); fallback to GPT-4o-mini on 3rd failure</w:t>
             </w:r>
           </w:p>
         </w:tc>
@@ -8602,7 +8389,7 @@
                 <w:sz w:val="20"/>
                 <w:szCs w:val="20"/>
               </w:rPr>
-              <w:t xml:space="preserve">LLM or search API 429</w:t>
+              <w:t xml:space="preserve">OpenAI or search API 429</w:t>
             </w:r>
           </w:p>
         </w:tc>
@@ -9381,7 +9168,7 @@
                 <w:sz w:val="20"/>
                 <w:szCs w:val="20"/>
               </w:rPr>
-              <w:t xml:space="preserve">Web Researcher x 4 sub-tasks</w:t>
+              <w:t xml:space="preserve">Web Researcher x 4 sub-tasks (GPT-4o)</w:t>
             </w:r>
           </w:p>
         </w:tc>
@@ -9476,7 +9263,7 @@
                 <w:sz w:val="20"/>
                 <w:szCs w:val="20"/>
               </w:rPr>
-              <w:t xml:space="preserve">Document Analyst x 4 sub-tasks</w:t>
+              <w:t xml:space="preserve">Document Analyst x 4 sub-tasks (GPT-4o)</w:t>
             </w:r>
           </w:p>
         </w:tc>
@@ -9571,7 +9358,7 @@
                 <w:sz w:val="20"/>
                 <w:szCs w:val="20"/>
               </w:rPr>
-              <w:t xml:space="preserve">Report Writer (synthesis)</w:t>
+              <w:t xml:space="preserve">Report Writer (synthesis, GPT-4o)</w:t>
             </w:r>
           </w:p>
         </w:tc>
@@ -9666,7 +9453,7 @@
                 <w:sz w:val="20"/>
                 <w:szCs w:val="20"/>
               </w:rPr>
-              <w:t xml:space="preserve">Embeddings (retrieval)</w:t>
+              <w:t xml:space="preserve">Embeddings (OpenAI text-embedding-3-small)</w:t>
             </w:r>
           </w:p>
         </w:tc>
@@ -10189,6 +9976,70 @@
                 <w:sz w:val="20"/>
                 <w:szCs w:val="20"/>
               </w:rPr>
+              <w:t xml:space="preserve">GPT-4o-mini fallback</w:t>
+            </w:r>
+          </w:p>
+        </w:tc>
+        <w:tc>
+          <w:tcPr>
+            <w:tcW w:type="dxa" w:w="6560"/>
+            <w:tcBorders>
+              <w:top w:val="single" w:color="CCCCCC" w:sz="1"/>
+              <w:left w:val="single" w:color="CCCCCC" w:sz="1"/>
+              <w:bottom w:val="single" w:color="CCCCCC" w:sz="1"/>
+              <w:right w:val="single" w:color="CCCCCC" w:sz="1"/>
+            </w:tcBorders>
+            <w:shd w:fill="F2F2F2" w:val="clear"/>
+            <w:tcMar>
+              <w:top w:type="dxa" w:w="80"/>
+              <w:left w:type="dxa" w:w="120"/>
+              <w:bottom w:type="dxa" w:w="80"/>
+              <w:right w:type="dxa" w:w="120"/>
+            </w:tcMar>
+          </w:tcPr>
+          <w:p>
+            <w:r>
+              <w:rPr>
+                <w:rFonts w:ascii="Arial" w:cs="Arial" w:eastAsia="Arial" w:hAnsi="Arial"/>
+                <w:b w:val="false"/>
+                <w:bCs w:val="false"/>
+                <w:color w:val="595959"/>
+                <w:sz w:val="20"/>
+                <w:szCs w:val="20"/>
+              </w:rPr>
+              <w:t xml:space="preserve">Retries and simpler sub-tasks (e.g., Wikipedia lookup, brief summarisation) automatically route to GPT-4o-mini, reducing cost by ~10x for those calls.</w:t>
+            </w:r>
+          </w:p>
+        </w:tc>
+      </w:tr>
+      <w:tr>
+        <w:tc>
+          <w:tcPr>
+            <w:tcW w:type="dxa" w:w="2800"/>
+            <w:tcBorders>
+              <w:top w:val="single" w:color="CCCCCC" w:sz="1"/>
+              <w:left w:val="single" w:color="CCCCCC" w:sz="1"/>
+              <w:bottom w:val="single" w:color="CCCCCC" w:sz="1"/>
+              <w:right w:val="single" w:color="CCCCCC" w:sz="1"/>
+            </w:tcBorders>
+            <w:shd w:fill="FFFFFF" w:val="clear"/>
+            <w:tcMar>
+              <w:top w:type="dxa" w:w="80"/>
+              <w:left w:type="dxa" w:w="120"/>
+              <w:bottom w:type="dxa" w:w="80"/>
+              <w:right w:type="dxa" w:w="120"/>
+            </w:tcMar>
+          </w:tcPr>
+          <w:p>
+            <w:r>
+              <w:rPr>
+                <w:rFonts w:ascii="Arial" w:cs="Arial" w:eastAsia="Arial" w:hAnsi="Arial"/>
+                <w:b w:val="false"/>
+                <w:bCs w:val="false"/>
+                <w:color w:val="595959"/>
+                <w:sz w:val="20"/>
+                <w:szCs w:val="20"/>
+              </w:rPr>
               <w:t xml:space="preserve">Source content truncation</w:t>
             </w:r>
           </w:p>
@@ -10253,7 +10104,7 @@
                 <w:sz w:val="20"/>
                 <w:szCs w:val="20"/>
               </w:rPr>
-              <w:t xml:space="preserve">Chunk re-use</w:t>
+              <w:t xml:space="preserve">Cost alerting</w:t>
             </w:r>
           </w:p>
         </w:tc>
@@ -10284,71 +10135,7 @@
                 <w:sz w:val="20"/>
                 <w:szCs w:val="20"/>
               </w:rPr>
-              <w:t xml:space="preserve">Cross-encoder output is cached per query+chunk pair within a session; prevents redundant re-ranking for overlapping sub-task queries.</w:t>
-            </w:r>
-          </w:p>
-        </w:tc>
-      </w:tr>
-      <w:tr>
-        <w:tc>
-          <w:tcPr>
-            <w:tcW w:type="dxa" w:w="2800"/>
-            <w:tcBorders>
-              <w:top w:val="single" w:color="CCCCCC" w:sz="1"/>
-              <w:left w:val="single" w:color="CCCCCC" w:sz="1"/>
-              <w:bottom w:val="single" w:color="CCCCCC" w:sz="1"/>
-              <w:right w:val="single" w:color="CCCCCC" w:sz="1"/>
-            </w:tcBorders>
-            <w:shd w:fill="FFFFFF" w:val="clear"/>
-            <w:tcMar>
-              <w:top w:type="dxa" w:w="80"/>
-              <w:left w:type="dxa" w:w="120"/>
-              <w:bottom w:type="dxa" w:w="80"/>
-              <w:right w:type="dxa" w:w="120"/>
-            </w:tcMar>
-          </w:tcPr>
-          <w:p>
-            <w:r>
-              <w:rPr>
-                <w:rFonts w:ascii="Arial" w:cs="Arial" w:eastAsia="Arial" w:hAnsi="Arial"/>
-                <w:b w:val="false"/>
-                <w:bCs w:val="false"/>
-                <w:color w:val="595959"/>
-                <w:sz w:val="20"/>
-                <w:szCs w:val="20"/>
-              </w:rPr>
-              <w:t xml:space="preserve">Cost alerting</w:t>
-            </w:r>
-          </w:p>
-        </w:tc>
-        <w:tc>
-          <w:tcPr>
-            <w:tcW w:type="dxa" w:w="6560"/>
-            <w:tcBorders>
-              <w:top w:val="single" w:color="CCCCCC" w:sz="1"/>
-              <w:left w:val="single" w:color="CCCCCC" w:sz="1"/>
-              <w:bottom w:val="single" w:color="CCCCCC" w:sz="1"/>
-              <w:right w:val="single" w:color="CCCCCC" w:sz="1"/>
-            </w:tcBorders>
-            <w:shd w:fill="F2F2F2" w:val="clear"/>
-            <w:tcMar>
-              <w:top w:type="dxa" w:w="80"/>
-              <w:left w:type="dxa" w:w="120"/>
-              <w:bottom w:type="dxa" w:w="80"/>
-              <w:right w:type="dxa" w:w="120"/>
-            </w:tcMar>
-          </w:tcPr>
-          <w:p>
-            <w:r>
-              <w:rPr>
-                <w:rFonts w:ascii="Arial" w:cs="Arial" w:eastAsia="Arial" w:hAnsi="Arial"/>
-                <w:b w:val="false"/>
-                <w:bCs w:val="false"/>
-                <w:color w:val="595959"/>
-                <w:sz w:val="20"/>
-                <w:szCs w:val="20"/>
-              </w:rPr>
-              <w:t xml:space="preserve">Langfuse budget alert triggers at $5/day and $50/month; surfaces in Slack via configurable webhook.</w:t>
+              <w:t xml:space="preserve">LangSmith budget tracking; alert triggers at $5/day and $50/month via configurable webhook.</w:t>
             </w:r>
           </w:p>
         </w:tc>
@@ -11761,7 +11548,7 @@
                 <w:sz w:val="20"/>
                 <w:szCs w:val="20"/>
               </w:rPr>
-              <w:t xml:space="preserve">LangSmith and Langfuse capture per-node latency in every trace; P50/P95 dashboards alert if targets are breached.</w:t>
+              <w:t xml:space="preserve">LangSmith captures per-node latency in every trace; P50/P95 dashboards alert if targets are breached.</w:t>
             </w:r>
           </w:p>
         </w:tc>
@@ -11936,6 +11723,20 @@
           <w:szCs w:val="28"/>
         </w:rPr>
         <w:t xml:space="preserve">5.2 Observability</w:t>
+      </w:r>
+    </w:p>
+    <w:p>
+      <w:pPr>
+        <w:spacing w:after="60" w:before="60"/>
+      </w:pPr>
+      <w:r>
+        <w:rPr>
+          <w:rFonts w:ascii="Arial" w:cs="Arial" w:eastAsia="Arial" w:hAnsi="Arial"/>
+          <w:color w:val="595959"/>
+          <w:sz w:val="22"/>
+          <w:szCs w:val="22"/>
+        </w:rPr>
+        <w:t xml:space="preserve">LangSmith is the sole observability platform, chosen for its native LangGraph integration:</w:t>
       </w:r>
     </w:p>
     <w:tbl>
@@ -11982,7 +11783,7 @@
                 <w:sz w:val="20"/>
                 <w:szCs w:val="20"/>
               </w:rPr>
-              <w:t xml:space="preserve">Tool</w:t>
+              <w:t xml:space="preserve">Capability</w:t>
             </w:r>
           </w:p>
         </w:tc>
@@ -12013,7 +11814,7 @@
                 <w:sz w:val="20"/>
                 <w:szCs w:val="20"/>
               </w:rPr>
-              <w:t xml:space="preserve">What It Captures</w:t>
+              <w:t xml:space="preserve">Detail</w:t>
             </w:r>
           </w:p>
         </w:tc>
@@ -12046,7 +11847,7 @@
                 <w:sz w:val="20"/>
                 <w:szCs w:val="20"/>
               </w:rPr>
-              <w:t xml:space="preserve">LangSmith</w:t>
+              <w:t xml:space="preserve">Distributed tracing</w:t>
             </w:r>
           </w:p>
         </w:tc>
@@ -12077,7 +11878,7 @@
                 <w:sz w:val="20"/>
                 <w:szCs w:val="20"/>
               </w:rPr>
-              <w:t xml:space="preserve">Full LangGraph trace per request: node-level execution, tool calls, LLM inputs/outputs, latency per node, error traces</w:t>
+              <w:t xml:space="preserve">Full LangGraph trace per request — node-level execution, tool calls, LLM inputs/outputs, and error traces</w:t>
             </w:r>
           </w:p>
         </w:tc>
@@ -12110,7 +11911,7 @@
                 <w:sz w:val="20"/>
                 <w:szCs w:val="20"/>
               </w:rPr>
-              <w:t xml:space="preserve">Langfuse</w:t>
+              <w:t xml:space="preserve">Latency monitoring</w:t>
             </w:r>
           </w:p>
         </w:tc>
@@ -12141,7 +11942,7 @@
                 <w:sz w:val="20"/>
                 <w:szCs w:val="20"/>
               </w:rPr>
-              <w:t xml:space="preserve">LLM call monitoring: token counts, model used, cost per call, latency distribution, user feedback scores</w:t>
+              <w:t xml:space="preserve">Per-node P50/P95 latency visible in the LangSmith dashboard; alerts configurable for breaches</w:t>
             </w:r>
           </w:p>
         </w:tc>
@@ -12174,6 +11975,134 @@
                 <w:sz w:val="20"/>
                 <w:szCs w:val="20"/>
               </w:rPr>
+              <w:t xml:space="preserve">Cost tracking</w:t>
+            </w:r>
+          </w:p>
+        </w:tc>
+        <w:tc>
+          <w:tcPr>
+            <w:tcW w:type="dxa" w:w="6560"/>
+            <w:tcBorders>
+              <w:top w:val="single" w:color="CCCCCC" w:sz="1"/>
+              <w:left w:val="single" w:color="CCCCCC" w:sz="1"/>
+              <w:bottom w:val="single" w:color="CCCCCC" w:sz="1"/>
+              <w:right w:val="single" w:color="CCCCCC" w:sz="1"/>
+            </w:tcBorders>
+            <w:shd w:fill="F2F2F2" w:val="clear"/>
+            <w:tcMar>
+              <w:top w:type="dxa" w:w="80"/>
+              <w:left w:type="dxa" w:w="120"/>
+              <w:bottom w:type="dxa" w:w="80"/>
+              <w:right w:type="dxa" w:w="120"/>
+            </w:tcMar>
+          </w:tcPr>
+          <w:p>
+            <w:r>
+              <w:rPr>
+                <w:rFonts w:ascii="Arial" w:cs="Arial" w:eastAsia="Arial" w:hAnsi="Arial"/>
+                <w:b w:val="false"/>
+                <w:bCs w:val="false"/>
+                <w:color w:val="595959"/>
+                <w:sz w:val="20"/>
+                <w:szCs w:val="20"/>
+              </w:rPr>
+              <w:t xml:space="preserve">Token counts and estimated cost per LLM call; aggregated daily/monthly spend view</w:t>
+            </w:r>
+          </w:p>
+        </w:tc>
+      </w:tr>
+      <w:tr>
+        <w:tc>
+          <w:tcPr>
+            <w:tcW w:type="dxa" w:w="2800"/>
+            <w:tcBorders>
+              <w:top w:val="single" w:color="CCCCCC" w:sz="1"/>
+              <w:left w:val="single" w:color="CCCCCC" w:sz="1"/>
+              <w:bottom w:val="single" w:color="CCCCCC" w:sz="1"/>
+              <w:right w:val="single" w:color="CCCCCC" w:sz="1"/>
+            </w:tcBorders>
+            <w:shd w:fill="FFFFFF" w:val="clear"/>
+            <w:tcMar>
+              <w:top w:type="dxa" w:w="80"/>
+              <w:left w:type="dxa" w:w="120"/>
+              <w:bottom w:type="dxa" w:w="80"/>
+              <w:right w:type="dxa" w:w="120"/>
+            </w:tcMar>
+          </w:tcPr>
+          <w:p>
+            <w:r>
+              <w:rPr>
+                <w:rFonts w:ascii="Arial" w:cs="Arial" w:eastAsia="Arial" w:hAnsi="Arial"/>
+                <w:b w:val="false"/>
+                <w:bCs w:val="false"/>
+                <w:color w:val="595959"/>
+                <w:sz w:val="20"/>
+                <w:szCs w:val="20"/>
+              </w:rPr>
+              <w:t xml:space="preserve">Feedback loop</w:t>
+            </w:r>
+          </w:p>
+        </w:tc>
+        <w:tc>
+          <w:tcPr>
+            <w:tcW w:type="dxa" w:w="6560"/>
+            <w:tcBorders>
+              <w:top w:val="single" w:color="CCCCCC" w:sz="1"/>
+              <w:left w:val="single" w:color="CCCCCC" w:sz="1"/>
+              <w:bottom w:val="single" w:color="CCCCCC" w:sz="1"/>
+              <w:right w:val="single" w:color="CCCCCC" w:sz="1"/>
+            </w:tcBorders>
+            <w:shd w:fill="F2F2F2" w:val="clear"/>
+            <w:tcMar>
+              <w:top w:type="dxa" w:w="80"/>
+              <w:left w:type="dxa" w:w="120"/>
+              <w:bottom w:type="dxa" w:w="80"/>
+              <w:right w:type="dxa" w:w="120"/>
+            </w:tcMar>
+          </w:tcPr>
+          <w:p>
+            <w:r>
+              <w:rPr>
+                <w:rFonts w:ascii="Arial" w:cs="Arial" w:eastAsia="Arial" w:hAnsi="Arial"/>
+                <w:b w:val="false"/>
+                <w:bCs w:val="false"/>
+                <w:color w:val="595959"/>
+                <w:sz w:val="20"/>
+                <w:szCs w:val="20"/>
+              </w:rPr>
+              <w:t xml:space="preserve">Human-in-the-loop feedback scores attachable to traces for report quality eval</w:t>
+            </w:r>
+          </w:p>
+        </w:tc>
+      </w:tr>
+      <w:tr>
+        <w:tc>
+          <w:tcPr>
+            <w:tcW w:type="dxa" w:w="2800"/>
+            <w:tcBorders>
+              <w:top w:val="single" w:color="CCCCCC" w:sz="1"/>
+              <w:left w:val="single" w:color="CCCCCC" w:sz="1"/>
+              <w:bottom w:val="single" w:color="CCCCCC" w:sz="1"/>
+              <w:right w:val="single" w:color="CCCCCC" w:sz="1"/>
+            </w:tcBorders>
+            <w:shd w:fill="FFFFFF" w:val="clear"/>
+            <w:tcMar>
+              <w:top w:type="dxa" w:w="80"/>
+              <w:left w:type="dxa" w:w="120"/>
+              <w:bottom w:type="dxa" w:w="80"/>
+              <w:right w:type="dxa" w:w="120"/>
+            </w:tcMar>
+          </w:tcPr>
+          <w:p>
+            <w:r>
+              <w:rPr>
+                <w:rFonts w:ascii="Arial" w:cs="Arial" w:eastAsia="Arial" w:hAnsi="Arial"/>
+                <w:b w:val="false"/>
+                <w:bCs w:val="false"/>
+                <w:color w:val="595959"/>
+                <w:sz w:val="20"/>
+                <w:szCs w:val="20"/>
+              </w:rPr>
               <w:t xml:space="preserve">Structured logging</w:t>
             </w:r>
           </w:p>
@@ -12205,7 +12134,7 @@
                 <w:sz w:val="20"/>
                 <w:szCs w:val="20"/>
               </w:rPr>
-              <w:t xml:space="preserve">Python logging with JSON formatter; captures request ID, query hash, sub-task count, total duration, error type on every request</w:t>
+              <w:t xml:space="preserve">Python logging with JSON formatter captures request ID, query hash, sub-task count, total duration, and error type</w:t>
             </w:r>
           </w:p>
         </w:tc>
@@ -12304,727 +12233,7 @@
           <w:sz w:val="36"/>
           <w:szCs w:val="36"/>
         </w:rPr>
-        <w:t xml:space="preserve">6. Risks &amp; Mitigations</w:t>
-      </w:r>
-    </w:p>
-    <w:tbl>
-      <w:tblPr>
-        <w:tblW w:type="dxa" w:w="9360"/>
-        <w:tblBorders>
-          <w:top w:val="single" w:color="auto" w:sz="4"/>
-          <w:left w:val="single" w:color="auto" w:sz="4"/>
-          <w:bottom w:val="single" w:color="auto" w:sz="4"/>
-          <w:right w:val="single" w:color="auto" w:sz="4"/>
-          <w:insideH w:val="single" w:color="auto" w:sz="4"/>
-          <w:insideV w:val="single" w:color="auto" w:sz="4"/>
-        </w:tblBorders>
-      </w:tblPr>
-      <w:tblGrid>
-        <w:gridCol w:w="2400"/>
-        <w:gridCol w:w="3780"/>
-        <w:gridCol w:w="3180"/>
-      </w:tblGrid>
-      <w:tr>
-        <w:tc>
-          <w:tcPr>
-            <w:tcW w:type="dxa" w:w="2400"/>
-            <w:tcBorders>
-              <w:top w:val="single" w:color="CCCCCC" w:sz="1"/>
-              <w:left w:val="single" w:color="CCCCCC" w:sz="1"/>
-              <w:bottom w:val="single" w:color="CCCCCC" w:sz="1"/>
-              <w:right w:val="single" w:color="CCCCCC" w:sz="1"/>
-            </w:tcBorders>
-            <w:shd w:fill="2E75B6" w:val="clear"/>
-            <w:tcMar>
-              <w:top w:type="dxa" w:w="80"/>
-              <w:left w:type="dxa" w:w="120"/>
-              <w:bottom w:type="dxa" w:w="80"/>
-              <w:right w:type="dxa" w:w="120"/>
-            </w:tcMar>
-          </w:tcPr>
-          <w:p>
-            <w:r>
-              <w:rPr>
-                <w:rFonts w:ascii="Arial" w:cs="Arial" w:eastAsia="Arial" w:hAnsi="Arial"/>
-                <w:b/>
-                <w:bCs/>
-                <w:color w:val="FFFFFF"/>
-                <w:sz w:val="20"/>
-                <w:szCs w:val="20"/>
-              </w:rPr>
-              <w:t xml:space="preserve">Risk</w:t>
-            </w:r>
-          </w:p>
-        </w:tc>
-        <w:tc>
-          <w:tcPr>
-            <w:tcW w:type="dxa" w:w="3780"/>
-            <w:tcBorders>
-              <w:top w:val="single" w:color="CCCCCC" w:sz="1"/>
-              <w:left w:val="single" w:color="CCCCCC" w:sz="1"/>
-              <w:bottom w:val="single" w:color="CCCCCC" w:sz="1"/>
-              <w:right w:val="single" w:color="CCCCCC" w:sz="1"/>
-            </w:tcBorders>
-            <w:shd w:fill="2E75B6" w:val="clear"/>
-            <w:tcMar>
-              <w:top w:type="dxa" w:w="80"/>
-              <w:left w:type="dxa" w:w="120"/>
-              <w:bottom w:type="dxa" w:w="80"/>
-              <w:right w:type="dxa" w:w="120"/>
-            </w:tcMar>
-          </w:tcPr>
-          <w:p>
-            <w:r>
-              <w:rPr>
-                <w:rFonts w:ascii="Arial" w:cs="Arial" w:eastAsia="Arial" w:hAnsi="Arial"/>
-                <w:b/>
-                <w:bCs/>
-                <w:color w:val="FFFFFF"/>
-                <w:sz w:val="20"/>
-                <w:szCs w:val="20"/>
-              </w:rPr>
-              <w:t xml:space="preserve">Likelihood</w:t>
-            </w:r>
-          </w:p>
-        </w:tc>
-        <w:tc>
-          <w:tcPr>
-            <w:tcW w:type="dxa" w:w="3180"/>
-            <w:tcBorders>
-              <w:top w:val="single" w:color="CCCCCC" w:sz="1"/>
-              <w:left w:val="single" w:color="CCCCCC" w:sz="1"/>
-              <w:bottom w:val="single" w:color="CCCCCC" w:sz="1"/>
-              <w:right w:val="single" w:color="CCCCCC" w:sz="1"/>
-            </w:tcBorders>
-            <w:shd w:fill="2E75B6" w:val="clear"/>
-            <w:tcMar>
-              <w:top w:type="dxa" w:w="80"/>
-              <w:left w:type="dxa" w:w="120"/>
-              <w:bottom w:type="dxa" w:w="80"/>
-              <w:right w:type="dxa" w:w="120"/>
-            </w:tcMar>
-          </w:tcPr>
-          <w:p>
-            <w:r>
-              <w:rPr>
-                <w:rFonts w:ascii="Arial" w:cs="Arial" w:eastAsia="Arial" w:hAnsi="Arial"/>
-                <w:b/>
-                <w:bCs/>
-                <w:color w:val="FFFFFF"/>
-                <w:sz w:val="20"/>
-                <w:szCs w:val="20"/>
-              </w:rPr>
-              <w:t xml:space="preserve">Mitigation</w:t>
-            </w:r>
-          </w:p>
-        </w:tc>
-      </w:tr>
-      <w:tr>
-        <w:tc>
-          <w:tcPr>
-            <w:tcW w:type="dxa" w:w="2400"/>
-            <w:tcBorders>
-              <w:top w:val="single" w:color="CCCCCC" w:sz="1"/>
-              <w:left w:val="single" w:color="CCCCCC" w:sz="1"/>
-              <w:bottom w:val="single" w:color="CCCCCC" w:sz="1"/>
-              <w:right w:val="single" w:color="CCCCCC" w:sz="1"/>
-            </w:tcBorders>
-            <w:shd w:fill="FFFFFF" w:val="clear"/>
-            <w:tcMar>
-              <w:top w:type="dxa" w:w="80"/>
-              <w:left w:type="dxa" w:w="120"/>
-              <w:bottom w:type="dxa" w:w="80"/>
-              <w:right w:type="dxa" w:w="120"/>
-            </w:tcMar>
-          </w:tcPr>
-          <w:p>
-            <w:r>
-              <w:rPr>
-                <w:rFonts w:ascii="Arial" w:cs="Arial" w:eastAsia="Arial" w:hAnsi="Arial"/>
-                <w:b w:val="false"/>
-                <w:bCs w:val="false"/>
-                <w:color w:val="595959"/>
-                <w:sz w:val="20"/>
-                <w:szCs w:val="20"/>
-              </w:rPr>
-              <w:t xml:space="preserve">LLM hallucination in synthesised report</w:t>
-            </w:r>
-          </w:p>
-        </w:tc>
-        <w:tc>
-          <w:tcPr>
-            <w:tcW w:type="dxa" w:w="3780"/>
-            <w:tcBorders>
-              <w:top w:val="single" w:color="CCCCCC" w:sz="1"/>
-              <w:left w:val="single" w:color="CCCCCC" w:sz="1"/>
-              <w:bottom w:val="single" w:color="CCCCCC" w:sz="1"/>
-              <w:right w:val="single" w:color="CCCCCC" w:sz="1"/>
-            </w:tcBorders>
-            <w:shd w:fill="FFFFFF" w:val="clear"/>
-            <w:tcMar>
-              <w:top w:type="dxa" w:w="80"/>
-              <w:left w:type="dxa" w:w="120"/>
-              <w:bottom w:type="dxa" w:w="80"/>
-              <w:right w:type="dxa" w:w="120"/>
-            </w:tcMar>
-          </w:tcPr>
-          <w:p>
-            <w:r>
-              <w:rPr>
-                <w:rFonts w:ascii="Arial" w:cs="Arial" w:eastAsia="Arial" w:hAnsi="Arial"/>
-                <w:b w:val="false"/>
-                <w:bCs w:val="false"/>
-                <w:color w:val="595959"/>
-                <w:sz w:val="20"/>
-                <w:szCs w:val="20"/>
-              </w:rPr>
-              <w:t xml:space="preserve">Medium</w:t>
-            </w:r>
-          </w:p>
-        </w:tc>
-        <w:tc>
-          <w:tcPr>
-            <w:tcW w:type="dxa" w:w="3180"/>
-            <w:tcBorders>
-              <w:top w:val="single" w:color="CCCCCC" w:sz="1"/>
-              <w:left w:val="single" w:color="CCCCCC" w:sz="1"/>
-              <w:bottom w:val="single" w:color="CCCCCC" w:sz="1"/>
-              <w:right w:val="single" w:color="CCCCCC" w:sz="1"/>
-            </w:tcBorders>
-            <w:shd w:fill="F2F2F2" w:val="clear"/>
-            <w:tcMar>
-              <w:top w:type="dxa" w:w="80"/>
-              <w:left w:type="dxa" w:w="120"/>
-              <w:bottom w:type="dxa" w:w="80"/>
-              <w:right w:type="dxa" w:w="120"/>
-            </w:tcMar>
-          </w:tcPr>
-          <w:p>
-            <w:r>
-              <w:rPr>
-                <w:rFonts w:ascii="Arial" w:cs="Arial" w:eastAsia="Arial" w:hAnsi="Arial"/>
-                <w:b w:val="false"/>
-                <w:bCs w:val="false"/>
-                <w:color w:val="595959"/>
-                <w:sz w:val="20"/>
-                <w:szCs w:val="20"/>
-              </w:rPr>
-              <w:t xml:space="preserve">Citation enforcement guardrail; LLM-as-judge eval; human review flag for low-confidence sections</w:t>
-            </w:r>
-          </w:p>
-        </w:tc>
-      </w:tr>
-      <w:tr>
-        <w:tc>
-          <w:tcPr>
-            <w:tcW w:type="dxa" w:w="2400"/>
-            <w:tcBorders>
-              <w:top w:val="single" w:color="CCCCCC" w:sz="1"/>
-              <w:left w:val="single" w:color="CCCCCC" w:sz="1"/>
-              <w:bottom w:val="single" w:color="CCCCCC" w:sz="1"/>
-              <w:right w:val="single" w:color="CCCCCC" w:sz="1"/>
-            </w:tcBorders>
-            <w:shd w:fill="FFFFFF" w:val="clear"/>
-            <w:tcMar>
-              <w:top w:type="dxa" w:w="80"/>
-              <w:left w:type="dxa" w:w="120"/>
-              <w:bottom w:type="dxa" w:w="80"/>
-              <w:right w:type="dxa" w:w="120"/>
-            </w:tcMar>
-          </w:tcPr>
-          <w:p>
-            <w:r>
-              <w:rPr>
-                <w:rFonts w:ascii="Arial" w:cs="Arial" w:eastAsia="Arial" w:hAnsi="Arial"/>
-                <w:b w:val="false"/>
-                <w:bCs w:val="false"/>
-                <w:color w:val="595959"/>
-                <w:sz w:val="20"/>
-                <w:szCs w:val="20"/>
-              </w:rPr>
-              <w:t xml:space="preserve">Tavily API rate limits during parallel search</w:t>
-            </w:r>
-          </w:p>
-        </w:tc>
-        <w:tc>
-          <w:tcPr>
-            <w:tcW w:type="dxa" w:w="3780"/>
-            <w:tcBorders>
-              <w:top w:val="single" w:color="CCCCCC" w:sz="1"/>
-              <w:left w:val="single" w:color="CCCCCC" w:sz="1"/>
-              <w:bottom w:val="single" w:color="CCCCCC" w:sz="1"/>
-              <w:right w:val="single" w:color="CCCCCC" w:sz="1"/>
-            </w:tcBorders>
-            <w:shd w:fill="FFFFFF" w:val="clear"/>
-            <w:tcMar>
-              <w:top w:type="dxa" w:w="80"/>
-              <w:left w:type="dxa" w:w="120"/>
-              <w:bottom w:type="dxa" w:w="80"/>
-              <w:right w:type="dxa" w:w="120"/>
-            </w:tcMar>
-          </w:tcPr>
-          <w:p>
-            <w:r>
-              <w:rPr>
-                <w:rFonts w:ascii="Arial" w:cs="Arial" w:eastAsia="Arial" w:hAnsi="Arial"/>
-                <w:b w:val="false"/>
-                <w:bCs w:val="false"/>
-                <w:color w:val="595959"/>
-                <w:sz w:val="20"/>
-                <w:szCs w:val="20"/>
-              </w:rPr>
-              <w:t xml:space="preserve">Medium</w:t>
-            </w:r>
-          </w:p>
-        </w:tc>
-        <w:tc>
-          <w:tcPr>
-            <w:tcW w:type="dxa" w:w="3180"/>
-            <w:tcBorders>
-              <w:top w:val="single" w:color="CCCCCC" w:sz="1"/>
-              <w:left w:val="single" w:color="CCCCCC" w:sz="1"/>
-              <w:bottom w:val="single" w:color="CCCCCC" w:sz="1"/>
-              <w:right w:val="single" w:color="CCCCCC" w:sz="1"/>
-            </w:tcBorders>
-            <w:shd w:fill="F2F2F2" w:val="clear"/>
-            <w:tcMar>
-              <w:top w:type="dxa" w:w="80"/>
-              <w:left w:type="dxa" w:w="120"/>
-              <w:bottom w:type="dxa" w:w="80"/>
-              <w:right w:type="dxa" w:w="120"/>
-            </w:tcMar>
-          </w:tcPr>
-          <w:p>
-            <w:r>
-              <w:rPr>
-                <w:rFonts w:ascii="Arial" w:cs="Arial" w:eastAsia="Arial" w:hAnsi="Arial"/>
-                <w:b w:val="false"/>
-                <w:bCs w:val="false"/>
-                <w:color w:val="595959"/>
-                <w:sz w:val="20"/>
-                <w:szCs w:val="20"/>
-              </w:rPr>
-              <w:t xml:space="preserve">Retry with backoff; request batching; cache frequent queries</w:t>
-            </w:r>
-          </w:p>
-        </w:tc>
-      </w:tr>
-      <w:tr>
-        <w:tc>
-          <w:tcPr>
-            <w:tcW w:type="dxa" w:w="2400"/>
-            <w:tcBorders>
-              <w:top w:val="single" w:color="CCCCCC" w:sz="1"/>
-              <w:left w:val="single" w:color="CCCCCC" w:sz="1"/>
-              <w:bottom w:val="single" w:color="CCCCCC" w:sz="1"/>
-              <w:right w:val="single" w:color="CCCCCC" w:sz="1"/>
-            </w:tcBorders>
-            <w:shd w:fill="FFFFFF" w:val="clear"/>
-            <w:tcMar>
-              <w:top w:type="dxa" w:w="80"/>
-              <w:left w:type="dxa" w:w="120"/>
-              <w:bottom w:type="dxa" w:w="80"/>
-              <w:right w:type="dxa" w:w="120"/>
-            </w:tcMar>
-          </w:tcPr>
-          <w:p>
-            <w:r>
-              <w:rPr>
-                <w:rFonts w:ascii="Arial" w:cs="Arial" w:eastAsia="Arial" w:hAnsi="Arial"/>
-                <w:b w:val="false"/>
-                <w:bCs w:val="false"/>
-                <w:color w:val="595959"/>
-                <w:sz w:val="20"/>
-                <w:szCs w:val="20"/>
-              </w:rPr>
-              <w:t xml:space="preserve">Knowledge base quality degradation over time</w:t>
-            </w:r>
-          </w:p>
-        </w:tc>
-        <w:tc>
-          <w:tcPr>
-            <w:tcW w:type="dxa" w:w="3780"/>
-            <w:tcBorders>
-              <w:top w:val="single" w:color="CCCCCC" w:sz="1"/>
-              <w:left w:val="single" w:color="CCCCCC" w:sz="1"/>
-              <w:bottom w:val="single" w:color="CCCCCC" w:sz="1"/>
-              <w:right w:val="single" w:color="CCCCCC" w:sz="1"/>
-            </w:tcBorders>
-            <w:shd w:fill="FFFFFF" w:val="clear"/>
-            <w:tcMar>
-              <w:top w:type="dxa" w:w="80"/>
-              <w:left w:type="dxa" w:w="120"/>
-              <w:bottom w:type="dxa" w:w="80"/>
-              <w:right w:type="dxa" w:w="120"/>
-            </w:tcMar>
-          </w:tcPr>
-          <w:p>
-            <w:r>
-              <w:rPr>
-                <w:rFonts w:ascii="Arial" w:cs="Arial" w:eastAsia="Arial" w:hAnsi="Arial"/>
-                <w:b w:val="false"/>
-                <w:bCs w:val="false"/>
-                <w:color w:val="595959"/>
-                <w:sz w:val="20"/>
-                <w:szCs w:val="20"/>
-              </w:rPr>
-              <w:t xml:space="preserve">Low</w:t>
-            </w:r>
-          </w:p>
-        </w:tc>
-        <w:tc>
-          <w:tcPr>
-            <w:tcW w:type="dxa" w:w="3180"/>
-            <w:tcBorders>
-              <w:top w:val="single" w:color="CCCCCC" w:sz="1"/>
-              <w:left w:val="single" w:color="CCCCCC" w:sz="1"/>
-              <w:bottom w:val="single" w:color="CCCCCC" w:sz="1"/>
-              <w:right w:val="single" w:color="CCCCCC" w:sz="1"/>
-            </w:tcBorders>
-            <w:shd w:fill="F2F2F2" w:val="clear"/>
-            <w:tcMar>
-              <w:top w:type="dxa" w:w="80"/>
-              <w:left w:type="dxa" w:w="120"/>
-              <w:bottom w:type="dxa" w:w="80"/>
-              <w:right w:type="dxa" w:w="120"/>
-            </w:tcMar>
-          </w:tcPr>
-          <w:p>
-            <w:r>
-              <w:rPr>
-                <w:rFonts w:ascii="Arial" w:cs="Arial" w:eastAsia="Arial" w:hAnsi="Arial"/>
-                <w:b w:val="false"/>
-                <w:bCs w:val="false"/>
-                <w:color w:val="595959"/>
-                <w:sz w:val="20"/>
-                <w:szCs w:val="20"/>
-              </w:rPr>
-              <w:t xml:space="preserve">Ingestion timestamp metadata; manual DELETE /ingest/{id} for stale docs</w:t>
-            </w:r>
-          </w:p>
-        </w:tc>
-      </w:tr>
-      <w:tr>
-        <w:tc>
-          <w:tcPr>
-            <w:tcW w:type="dxa" w:w="2400"/>
-            <w:tcBorders>
-              <w:top w:val="single" w:color="CCCCCC" w:sz="1"/>
-              <w:left w:val="single" w:color="CCCCCC" w:sz="1"/>
-              <w:bottom w:val="single" w:color="CCCCCC" w:sz="1"/>
-              <w:right w:val="single" w:color="CCCCCC" w:sz="1"/>
-            </w:tcBorders>
-            <w:shd w:fill="FFFFFF" w:val="clear"/>
-            <w:tcMar>
-              <w:top w:type="dxa" w:w="80"/>
-              <w:left w:type="dxa" w:w="120"/>
-              <w:bottom w:type="dxa" w:w="80"/>
-              <w:right w:type="dxa" w:w="120"/>
-            </w:tcMar>
-          </w:tcPr>
-          <w:p>
-            <w:r>
-              <w:rPr>
-                <w:rFonts w:ascii="Arial" w:cs="Arial" w:eastAsia="Arial" w:hAnsi="Arial"/>
-                <w:b w:val="false"/>
-                <w:bCs w:val="false"/>
-                <w:color w:val="595959"/>
-                <w:sz w:val="20"/>
-                <w:szCs w:val="20"/>
-              </w:rPr>
-              <w:t xml:space="preserve">Notion MCP API breaking changes</w:t>
-            </w:r>
-          </w:p>
-        </w:tc>
-        <w:tc>
-          <w:tcPr>
-            <w:tcW w:type="dxa" w:w="3780"/>
-            <w:tcBorders>
-              <w:top w:val="single" w:color="CCCCCC" w:sz="1"/>
-              <w:left w:val="single" w:color="CCCCCC" w:sz="1"/>
-              <w:bottom w:val="single" w:color="CCCCCC" w:sz="1"/>
-              <w:right w:val="single" w:color="CCCCCC" w:sz="1"/>
-            </w:tcBorders>
-            <w:shd w:fill="FFFFFF" w:val="clear"/>
-            <w:tcMar>
-              <w:top w:type="dxa" w:w="80"/>
-              <w:left w:type="dxa" w:w="120"/>
-              <w:bottom w:type="dxa" w:w="80"/>
-              <w:right w:type="dxa" w:w="120"/>
-            </w:tcMar>
-          </w:tcPr>
-          <w:p>
-            <w:r>
-              <w:rPr>
-                <w:rFonts w:ascii="Arial" w:cs="Arial" w:eastAsia="Arial" w:hAnsi="Arial"/>
-                <w:b w:val="false"/>
-                <w:bCs w:val="false"/>
-                <w:color w:val="595959"/>
-                <w:sz w:val="20"/>
-                <w:szCs w:val="20"/>
-              </w:rPr>
-              <w:t xml:space="preserve">Low</w:t>
-            </w:r>
-          </w:p>
-        </w:tc>
-        <w:tc>
-          <w:tcPr>
-            <w:tcW w:type="dxa" w:w="3180"/>
-            <w:tcBorders>
-              <w:top w:val="single" w:color="CCCCCC" w:sz="1"/>
-              <w:left w:val="single" w:color="CCCCCC" w:sz="1"/>
-              <w:bottom w:val="single" w:color="CCCCCC" w:sz="1"/>
-              <w:right w:val="single" w:color="CCCCCC" w:sz="1"/>
-            </w:tcBorders>
-            <w:shd w:fill="F2F2F2" w:val="clear"/>
-            <w:tcMar>
-              <w:top w:type="dxa" w:w="80"/>
-              <w:left w:type="dxa" w:w="120"/>
-              <w:bottom w:type="dxa" w:w="80"/>
-              <w:right w:type="dxa" w:w="120"/>
-            </w:tcMar>
-          </w:tcPr>
-          <w:p>
-            <w:r>
-              <w:rPr>
-                <w:rFonts w:ascii="Arial" w:cs="Arial" w:eastAsia="Arial" w:hAnsi="Arial"/>
-                <w:b w:val="false"/>
-                <w:bCs w:val="false"/>
-                <w:color w:val="595959"/>
-                <w:sz w:val="20"/>
-                <w:szCs w:val="20"/>
-              </w:rPr>
-              <w:t xml:space="preserve">Pin Notion API version; integration test suite catches breakage on CI</w:t>
-            </w:r>
-          </w:p>
-        </w:tc>
-      </w:tr>
-      <w:tr>
-        <w:tc>
-          <w:tcPr>
-            <w:tcW w:type="dxa" w:w="2400"/>
-            <w:tcBorders>
-              <w:top w:val="single" w:color="CCCCCC" w:sz="1"/>
-              <w:left w:val="single" w:color="CCCCCC" w:sz="1"/>
-              <w:bottom w:val="single" w:color="CCCCCC" w:sz="1"/>
-              <w:right w:val="single" w:color="CCCCCC" w:sz="1"/>
-            </w:tcBorders>
-            <w:shd w:fill="FFFFFF" w:val="clear"/>
-            <w:tcMar>
-              <w:top w:type="dxa" w:w="80"/>
-              <w:left w:type="dxa" w:w="120"/>
-              <w:bottom w:type="dxa" w:w="80"/>
-              <w:right w:type="dxa" w:w="120"/>
-            </w:tcMar>
-          </w:tcPr>
-          <w:p>
-            <w:r>
-              <w:rPr>
-                <w:rFonts w:ascii="Arial" w:cs="Arial" w:eastAsia="Arial" w:hAnsi="Arial"/>
-                <w:b w:val="false"/>
-                <w:bCs w:val="false"/>
-                <w:color w:val="595959"/>
-                <w:sz w:val="20"/>
-                <w:szCs w:val="20"/>
-              </w:rPr>
-              <w:t xml:space="preserve">Cross-encoder latency on large candidate sets</w:t>
-            </w:r>
-          </w:p>
-        </w:tc>
-        <w:tc>
-          <w:tcPr>
-            <w:tcW w:type="dxa" w:w="3780"/>
-            <w:tcBorders>
-              <w:top w:val="single" w:color="CCCCCC" w:sz="1"/>
-              <w:left w:val="single" w:color="CCCCCC" w:sz="1"/>
-              <w:bottom w:val="single" w:color="CCCCCC" w:sz="1"/>
-              <w:right w:val="single" w:color="CCCCCC" w:sz="1"/>
-            </w:tcBorders>
-            <w:shd w:fill="FFFFFF" w:val="clear"/>
-            <w:tcMar>
-              <w:top w:type="dxa" w:w="80"/>
-              <w:left w:type="dxa" w:w="120"/>
-              <w:bottom w:type="dxa" w:w="80"/>
-              <w:right w:type="dxa" w:w="120"/>
-            </w:tcMar>
-          </w:tcPr>
-          <w:p>
-            <w:r>
-              <w:rPr>
-                <w:rFonts w:ascii="Arial" w:cs="Arial" w:eastAsia="Arial" w:hAnsi="Arial"/>
-                <w:b w:val="false"/>
-                <w:bCs w:val="false"/>
-                <w:color w:val="595959"/>
-                <w:sz w:val="20"/>
-                <w:szCs w:val="20"/>
-              </w:rPr>
-              <w:t xml:space="preserve">Low</w:t>
-            </w:r>
-          </w:p>
-        </w:tc>
-        <w:tc>
-          <w:tcPr>
-            <w:tcW w:type="dxa" w:w="3180"/>
-            <w:tcBorders>
-              <w:top w:val="single" w:color="CCCCCC" w:sz="1"/>
-              <w:left w:val="single" w:color="CCCCCC" w:sz="1"/>
-              <w:bottom w:val="single" w:color="CCCCCC" w:sz="1"/>
-              <w:right w:val="single" w:color="CCCCCC" w:sz="1"/>
-            </w:tcBorders>
-            <w:shd w:fill="F2F2F2" w:val="clear"/>
-            <w:tcMar>
-              <w:top w:type="dxa" w:w="80"/>
-              <w:left w:type="dxa" w:w="120"/>
-              <w:bottom w:type="dxa" w:w="80"/>
-              <w:right w:type="dxa" w:w="120"/>
-            </w:tcMar>
-          </w:tcPr>
-          <w:p>
-            <w:r>
-              <w:rPr>
-                <w:rFonts w:ascii="Arial" w:cs="Arial" w:eastAsia="Arial" w:hAnsi="Arial"/>
-                <w:b w:val="false"/>
-                <w:bCs w:val="false"/>
-                <w:color w:val="595959"/>
-                <w:sz w:val="20"/>
-                <w:szCs w:val="20"/>
-              </w:rPr>
-              <w:t xml:space="preserve">Candidate set capped at 10 before re-ranking; cross-encoder is CPU-bound but fast at this scale (&lt;200ms)</w:t>
-            </w:r>
-          </w:p>
-        </w:tc>
-      </w:tr>
-      <w:tr>
-        <w:tc>
-          <w:tcPr>
-            <w:tcW w:type="dxa" w:w="2400"/>
-            <w:tcBorders>
-              <w:top w:val="single" w:color="CCCCCC" w:sz="1"/>
-              <w:left w:val="single" w:color="CCCCCC" w:sz="1"/>
-              <w:bottom w:val="single" w:color="CCCCCC" w:sz="1"/>
-              <w:right w:val="single" w:color="CCCCCC" w:sz="1"/>
-            </w:tcBorders>
-            <w:shd w:fill="FFFFFF" w:val="clear"/>
-            <w:tcMar>
-              <w:top w:type="dxa" w:w="80"/>
-              <w:left w:type="dxa" w:w="120"/>
-              <w:bottom w:type="dxa" w:w="80"/>
-              <w:right w:type="dxa" w:w="120"/>
-            </w:tcMar>
-          </w:tcPr>
-          <w:p>
-            <w:r>
-              <w:rPr>
-                <w:rFonts w:ascii="Arial" w:cs="Arial" w:eastAsia="Arial" w:hAnsi="Arial"/>
-                <w:b w:val="false"/>
-                <w:bCs w:val="false"/>
-                <w:color w:val="595959"/>
-                <w:sz w:val="20"/>
-                <w:szCs w:val="20"/>
-              </w:rPr>
-              <w:t xml:space="preserve">Scope creep into regulated domains</w:t>
-            </w:r>
-          </w:p>
-        </w:tc>
-        <w:tc>
-          <w:tcPr>
-            <w:tcW w:type="dxa" w:w="3780"/>
-            <w:tcBorders>
-              <w:top w:val="single" w:color="CCCCCC" w:sz="1"/>
-              <w:left w:val="single" w:color="CCCCCC" w:sz="1"/>
-              <w:bottom w:val="single" w:color="CCCCCC" w:sz="1"/>
-              <w:right w:val="single" w:color="CCCCCC" w:sz="1"/>
-            </w:tcBorders>
-            <w:shd w:fill="FFFFFF" w:val="clear"/>
-            <w:tcMar>
-              <w:top w:type="dxa" w:w="80"/>
-              <w:left w:type="dxa" w:w="120"/>
-              <w:bottom w:type="dxa" w:w="80"/>
-              <w:right w:type="dxa" w:w="120"/>
-            </w:tcMar>
-          </w:tcPr>
-          <w:p>
-            <w:r>
-              <w:rPr>
-                <w:rFonts w:ascii="Arial" w:cs="Arial" w:eastAsia="Arial" w:hAnsi="Arial"/>
-                <w:b w:val="false"/>
-                <w:bCs w:val="false"/>
-                <w:color w:val="595959"/>
-                <w:sz w:val="20"/>
-                <w:szCs w:val="20"/>
-              </w:rPr>
-              <w:t xml:space="preserve">Low</w:t>
-            </w:r>
-          </w:p>
-        </w:tc>
-        <w:tc>
-          <w:tcPr>
-            <w:tcW w:type="dxa" w:w="3180"/>
-            <w:tcBorders>
-              <w:top w:val="single" w:color="CCCCCC" w:sz="1"/>
-              <w:left w:val="single" w:color="CCCCCC" w:sz="1"/>
-              <w:bottom w:val="single" w:color="CCCCCC" w:sz="1"/>
-              <w:right w:val="single" w:color="CCCCCC" w:sz="1"/>
-            </w:tcBorders>
-            <w:shd w:fill="F2F2F2" w:val="clear"/>
-            <w:tcMar>
-              <w:top w:type="dxa" w:w="80"/>
-              <w:left w:type="dxa" w:w="120"/>
-              <w:bottom w:type="dxa" w:w="80"/>
-              <w:right w:type="dxa" w:w="120"/>
-            </w:tcMar>
-          </w:tcPr>
-          <w:p>
-            <w:r>
-              <w:rPr>
-                <w:rFonts w:ascii="Arial" w:cs="Arial" w:eastAsia="Arial" w:hAnsi="Arial"/>
-                <w:b w:val="false"/>
-                <w:bCs w:val="false"/>
-                <w:color w:val="595959"/>
-                <w:sz w:val="20"/>
-                <w:szCs w:val="20"/>
-              </w:rPr>
-              <w:t xml:space="preserve">Topic safety filter in Coordinator system prompt; explicit disclaimer in Streamlit UI</w:t>
-            </w:r>
-          </w:p>
-        </w:tc>
-      </w:tr>
-    </w:tbl>
-    <w:p>
-      <w:pPr>
-        <w:spacing w:after="0" w:before="0"/>
-      </w:pPr>
-      <w:r>
-        <w:rPr>
-          <w:sz w:val="22"/>
-          <w:szCs w:val="22"/>
-        </w:rPr>
-        <w:t xml:space="preserve"/>
-      </w:r>
-    </w:p>
-    <w:p>
-      <w:r>
-        <w:br w:type="page"/>
-      </w:r>
-    </w:p>
-    <w:p>
-      <w:pPr>
-        <w:pStyle w:val="Heading1"/>
-        <w:pBdr>
-          <w:bottom w:val="single" w:color="2E75B6" w:sz="8" w:space="4"/>
-        </w:pBdr>
-        <w:spacing w:after="160" w:before="400"/>
-      </w:pPr>
-      <w:r>
-        <w:rPr>
-          <w:rFonts w:ascii="Arial" w:cs="Arial" w:eastAsia="Arial" w:hAnsi="Arial"/>
-          <w:b/>
-          <w:bCs/>
-          <w:color w:val="1F4E79"/>
-          <w:sz w:val="36"/>
-          <w:szCs w:val="36"/>
-        </w:rPr>
-        <w:t xml:space="preserve">7. Appendix — Environment Variables</w:t>
+        <w:t xml:space="preserve">6. Appendix — Environment Variables</w:t>
       </w:r>
     </w:p>
     <w:tbl>
@@ -13135,7 +12344,7 @@
                 <w:sz w:val="20"/>
                 <w:szCs w:val="20"/>
               </w:rPr>
-              <w:t xml:space="preserve">ANTHROPIC_API_KEY</w:t>
+              <w:t xml:space="preserve">OPENAI_API_KEY</w:t>
             </w:r>
           </w:p>
         </w:tc>
@@ -13166,7 +12375,7 @@
                 <w:sz w:val="20"/>
                 <w:szCs w:val="20"/>
               </w:rPr>
-              <w:t xml:space="preserve">Claude Sonnet 4.6 access</w:t>
+              <w:t xml:space="preserve">GPT-4o (primary) + GPT-4o-mini (fallback) + text-embedding-3-small</w:t>
             </w:r>
           </w:p>
         </w:tc>
@@ -13199,7 +12408,7 @@
                 <w:sz w:val="20"/>
                 <w:szCs w:val="20"/>
               </w:rPr>
-              <w:t xml:space="preserve">OPENAI_API_KEY</w:t>
+              <w:t xml:space="preserve">TAVILY_API_KEY</w:t>
             </w:r>
           </w:p>
         </w:tc>
@@ -13230,7 +12439,7 @@
                 <w:sz w:val="20"/>
                 <w:szCs w:val="20"/>
               </w:rPr>
-              <w:t xml:space="preserve">GPT-4o fallback + text-embedding-3-small</w:t>
+              <w:t xml:space="preserve">Web search via Tavily MCP</w:t>
             </w:r>
           </w:p>
         </w:tc>
@@ -13263,7 +12472,7 @@
                 <w:sz w:val="20"/>
                 <w:szCs w:val="20"/>
               </w:rPr>
-              <w:t xml:space="preserve">TAVILY_API_KEY</w:t>
+              <w:t xml:space="preserve">QDRANT_URL</w:t>
             </w:r>
           </w:p>
         </w:tc>
@@ -13294,7 +12503,7 @@
                 <w:sz w:val="20"/>
                 <w:szCs w:val="20"/>
               </w:rPr>
-              <w:t xml:space="preserve">Web search via Tavily MCP</w:t>
+              <w:t xml:space="preserve">Qdrant vector store connection (default: http://localhost:6333)</w:t>
             </w:r>
           </w:p>
         </w:tc>
@@ -13327,7 +12536,7 @@
                 <w:sz w:val="20"/>
                 <w:szCs w:val="20"/>
               </w:rPr>
-              <w:t xml:space="preserve">QDRANT_URL</w:t>
+              <w:t xml:space="preserve">QDRANT_COLLECTION</w:t>
             </w:r>
           </w:p>
         </w:tc>
@@ -13358,7 +12567,7 @@
                 <w:sz w:val="20"/>
                 <w:szCs w:val="20"/>
               </w:rPr>
-              <w:t xml:space="preserve">Qdrant vector store connection (default: http://localhost:6333)</w:t>
+              <w:t xml:space="preserve">Collection name (default: researchiq)</w:t>
             </w:r>
           </w:p>
         </w:tc>
@@ -13391,7 +12600,7 @@
                 <w:sz w:val="20"/>
                 <w:szCs w:val="20"/>
               </w:rPr>
-              <w:t xml:space="preserve">QDRANT_COLLECTION</w:t>
+              <w:t xml:space="preserve">NOTION_TOKEN</w:t>
             </w:r>
           </w:p>
         </w:tc>
@@ -13422,7 +12631,7 @@
                 <w:sz w:val="20"/>
                 <w:szCs w:val="20"/>
               </w:rPr>
-              <w:t xml:space="preserve">Collection name (default: researchiq)</w:t>
+              <w:t xml:space="preserve">Notion integration token for MCP report save</w:t>
             </w:r>
           </w:p>
         </w:tc>
@@ -13455,7 +12664,7 @@
                 <w:sz w:val="20"/>
                 <w:szCs w:val="20"/>
               </w:rPr>
-              <w:t xml:space="preserve">NOTION_TOKEN</w:t>
+              <w:t xml:space="preserve">NOTION_DATABASE_ID</w:t>
             </w:r>
           </w:p>
         </w:tc>
@@ -13486,7 +12695,7 @@
                 <w:sz w:val="20"/>
                 <w:szCs w:val="20"/>
               </w:rPr>
-              <w:t xml:space="preserve">Notion integration token for MCP report save</w:t>
+              <w:t xml:space="preserve">Target Notion database for report pages</w:t>
             </w:r>
           </w:p>
         </w:tc>
@@ -13519,7 +12728,7 @@
                 <w:sz w:val="20"/>
                 <w:szCs w:val="20"/>
               </w:rPr>
-              <w:t xml:space="preserve">NOTION_DATABASE_ID</w:t>
+              <w:t xml:space="preserve">LANGCHAIN_API_KEY</w:t>
             </w:r>
           </w:p>
         </w:tc>
@@ -13550,7 +12759,7 @@
                 <w:sz w:val="20"/>
                 <w:szCs w:val="20"/>
               </w:rPr>
-              <w:t xml:space="preserve">Target Notion database for report pages</w:t>
+              <w:t xml:space="preserve">LangSmith tracing and observability</w:t>
             </w:r>
           </w:p>
         </w:tc>
@@ -13583,7 +12792,7 @@
                 <w:sz w:val="20"/>
                 <w:szCs w:val="20"/>
               </w:rPr>
-              <w:t xml:space="preserve">LANGCHAIN_API_KEY</w:t>
+              <w:t xml:space="preserve">LANGCHAIN_TRACING_V2</w:t>
             </w:r>
           </w:p>
         </w:tc>
@@ -13614,7 +12823,7 @@
                 <w:sz w:val="20"/>
                 <w:szCs w:val="20"/>
               </w:rPr>
-              <w:t xml:space="preserve">LangSmith tracing</w:t>
+              <w:t xml:space="preserve">Enable LangSmith tracing (set to true)</w:t>
             </w:r>
           </w:p>
         </w:tc>
@@ -13647,7 +12856,7 @@
                 <w:sz w:val="20"/>
                 <w:szCs w:val="20"/>
               </w:rPr>
-              <w:t xml:space="preserve">LANGFUSE_PUBLIC_KEY / SECRET_KEY</w:t>
+              <w:t xml:space="preserve">LANGCHAIN_PROJECT</w:t>
             </w:r>
           </w:p>
         </w:tc>
@@ -13678,7 +12887,7 @@
                 <w:sz w:val="20"/>
                 <w:szCs w:val="20"/>
               </w:rPr>
-              <w:t xml:space="preserve">Langfuse cost + latency monitoring</w:t>
+              <w:t xml:space="preserve">LangSmith project name (default: researchiq)</w:t>
             </w:r>
           </w:p>
         </w:tc>
@@ -13716,8 +12925,8 @@
       </w:pPr>
       <w:r>
         <w:rPr>
-          <w:sz w:val="44"/>
-          <w:szCs w:val="44"/>
+          <w:sz w:val="22"/>
+          <w:szCs w:val="22"/>
         </w:rPr>
         <w:t xml:space="preserve"/>
       </w:r>

</xml_diff>